<commit_message>
Align documentation with the current system
Follow the final document guideline: cover, supervisor, declaration,
dedication, acknowledgements, contents, chapters 1-7, appendices.
Remove the mobile app, the officer role and the alerts feature from the
text, diagrams and screenshots. Keep five proven objectives, use present
tense, and refresh test results (335 tests, 21 live checks).

Co-Authored-By: Claude Sonnet 5.5 <noreply@anthropic.com>
</commit_message>
<xml_diff>
--- a/docs/project-documentation/Chapter_1_Project_Identification.docx
+++ b/docs/project-documentation/Chapter_1_Project_Identification.docx
@@ -194,7 +194,7 @@
         <w:t xml:space="preserve">Topic.</w:t>
       </w:r>
       <w:r>
-        <w:t xml:space="preserve"> CyberShield Hub is a web and mobile system for cybersecurity awareness and incident response. It puts security training, quizzes, phishing practice, incident reporting and incident handling in one safe place.</w:t>
+        <w:t xml:space="preserve"> CyberShield Hub is a web system for cybersecurity awareness and incident response. It holds security training, quizzes, phishing practice, incident reporting and incident handling in one place.</w:t>
       </w:r>
     </w:p>
     <w:p>
@@ -209,7 +209,7 @@
         <w:t xml:space="preserve">Why.</w:t>
       </w:r>
       <w:r>
-        <w:t xml:space="preserve"> Most security problems start with a human action. A worker may click a bad link, use a weak password or forget to report a strange event. Many organisations use separate tools for these tasks, such as talks, posters, e-mail and spreadsheets. These tools do not work together. Nobody can tell what staff have learned or how risky the organisation is. Incidents are reported late, with missing facts, and are often never closed.</w:t>
+        <w:t xml:space="preserve"> Most security problems start with a human action, such as clicking a bad link, using a weak password or not reporting a strange event. Many organisations use separate tools for these tasks: talks, posters, e-mail and spreadsheets. The tools do not work together. Nobody sees what staff have learned or how risky the organisation is. Incidents are reported late, with missing facts, and are often not closed.</w:t>
       </w:r>
     </w:p>
     <w:p>
@@ -224,7 +224,7 @@
         <w:t xml:space="preserve">How.</w:t>
       </w:r>
       <w:r>
-        <w:t xml:space="preserve"> The project builds one system with three types of user: normal user, cybersecurity officer and system administrator. Normal users study lessons, take timed quizzes and practise on a simulated phishing inbox. They also report incidents and attach evidence. Officers see each report in a board of columns (a Kanban board). They assign it to a person, change its status and record each step. Administrators manage users, lessons, quizzes and alerts, and they can check an audit log. Dashboards turn all this activity into scores that managers can read.</w:t>
+        <w:t xml:space="preserve"> The system has two types of user: normal user and system administrator. Normal users study lessons, take timed quizzes, practise on a simulated phishing inbox and report incidents with evidence. Administrators see each report in a board of columns. They assign it, change its status and record each step on a timeline. They also manage users, lessons and quizzes, and check an audit log. Dashboards show scores for each user and for the organisation.</w:t>
       </w:r>
     </w:p>
     <w:p>
@@ -232,7 +232,7 @@
         <w:spacing w:after="120" w:line="300"/>
       </w:pPr>
       <w:r>
-        <w:t xml:space="preserve">The server uses Python and Django with a REST API. The web app uses React. The mobile app uses Flutter. The database is SQLite for development and MySQL for real use.</w:t>
+        <w:t xml:space="preserve">The server uses Python and Django with a REST API. The web app uses React. The database is SQLite or MySQL.</w:t>
       </w:r>
     </w:p>
     <w:p>
@@ -244,10 +244,10 @@
           <w:b/>
           <w:bCs/>
         </w:rPr>
-        <w:t xml:space="preserve">Expected result.</w:t>
-      </w:r>
-      <w:r>
-        <w:t xml:space="preserve"> Staff become more aware of threats. Incidents are reported faster and with better detail. The organisation has a clear record of training and response.</w:t>
+        <w:t xml:space="preserve">Result.</w:t>
+      </w:r>
+      <w:r>
+        <w:t xml:space="preserve"> Staff learn about threats and are tested. Incidents are reported with a reference number and evidence. Every step of a case is on record.</w:t>
       </w:r>
     </w:p>
     <w:p>
@@ -271,7 +271,7 @@
         <w:spacing w:after="120" w:line="300"/>
       </w:pPr>
       <w:r>
-        <w:t xml:space="preserve">CyberShield Hub is made for small and medium organisations, such as companies, schools, colleges and clinics. These organisations depend on computers, e-mail and shared networks. Most of them have no tool for security awareness. They usually have a small IT team of two to five people. The team also looks after computers, networks and user support. Security is only one of their many jobs. For this reason the new system must be easy for a small team to run, and it must also grow if the organisation grows.</w:t>
+        <w:t xml:space="preserve">The system is made for small and medium organisations, such as companies, schools, colleges and clinics. These organisations depend on computers, e-mail and shared networks. They have a small IT team of two to five people. The team also looks after computers, networks and user support. Security is one of many jobs. The system is simple enough for a small team to run.</w:t>
       </w:r>
     </w:p>
     <w:p>
@@ -280,14 +280,6 @@
       </w:pPr>
       <w:r>
         <w:t xml:space="preserve">1.2.2 How the current system works</w:t>
-      </w:r>
-    </w:p>
-    <w:p>
-      <w:pPr>
-        <w:spacing w:after="120" w:line="300"/>
-      </w:pPr>
-      <w:r>
-        <w:t xml:space="preserve">In a typical organisation today:</w:t>
       </w:r>
     </w:p>
     <w:p>
@@ -307,7 +299,7 @@
         <w:t xml:space="preserve">Training</w:t>
       </w:r>
       <w:r>
-        <w:t xml:space="preserve"> is an occasional talk, a poster or a PDF sent by e-mail. A paper list may record who attended, but nobody checks if staff understood.</w:t>
+        <w:t xml:space="preserve"> is an occasional talk, a poster or a PDF sent by e-mail. A paper list records who attended. Nobody checks if staff understood.</w:t>
       </w:r>
     </w:p>
     <w:p>
@@ -347,7 +339,7 @@
         <w:t xml:space="preserve">Phishing awareness</w:t>
       </w:r>
       <w:r>
-        <w:t xml:space="preserve"> comes from warning e-mails sent by IT. Staff never practise on safe examples.</w:t>
+        <w:t xml:space="preserve"> comes from warning e-mails sent by IT. Staff do not practise on safe examples.</w:t>
       </w:r>
     </w:p>
     <w:p>
@@ -367,7 +359,7 @@
         <w:t xml:space="preserve">Incident reporting</w:t>
       </w:r>
       <w:r>
-        <w:t xml:space="preserve"> is a phone call, a chat message, an e-mail or a hand-written form. There is no standard format, no reference number and no way to keep evidence.</w:t>
+        <w:t xml:space="preserve"> is a phone call, a chat message, an e-mail or a hand-written form. There is no standard format, no reference number and no place for evidence.</w:t>
       </w:r>
     </w:p>
     <w:p>
@@ -387,7 +379,7 @@
         <w:t xml:space="preserve">Incident tracking</w:t>
       </w:r>
       <w:r>
-        <w:t xml:space="preserve"> uses a spreadsheet or the memory of one IT officer. There is no record of who is working on a case, and no fixed steps.</w:t>
+        <w:t xml:space="preserve"> uses a spreadsheet or the memory of one IT manager. There is no record of who works on a case.</w:t>
       </w:r>
     </w:p>
     <w:p>
@@ -878,7 +870,7 @@
                 <w:sz w:val="19"/>
                 <w:szCs w:val="19"/>
               </w:rPr>
-              <w:t xml:space="preserve">Incidents are reported late and in an informal way</w:t>
+              <w:t xml:space="preserve">Incidents are reported late and informally</w:t>
             </w:r>
           </w:p>
         </w:tc>
@@ -1077,7 +1069,7 @@
                 <w:sz w:val="19"/>
                 <w:szCs w:val="19"/>
               </w:rPr>
-              <w:t xml:space="preserve">Work is repeated, cases are forgotten and not closed</w:t>
+              <w:t xml:space="preserve">Work is repeated and cases are forgotten</w:t>
             </w:r>
           </w:p>
         </w:tc>
@@ -1340,92 +1332,6 @@
           </w:p>
         </w:tc>
       </w:tr>
-      <w:tr>
-        <w:trPr>
-          <w:cantSplit/>
-        </w:trPr>
-        <w:tc>
-          <w:tcPr>
-            <w:tcW w:type="dxa" w:w="700"/>
-            <w:tcBorders>
-              <w:top w:val="single" w:color="B8C2D0" w:sz="4"/>
-              <w:left w:val="single" w:color="B8C2D0" w:sz="4"/>
-              <w:bottom w:val="single" w:color="B8C2D0" w:sz="4"/>
-              <w:right w:val="single" w:color="B8C2D0" w:sz="4"/>
-            </w:tcBorders>
-            <w:shd w:fill="FFFFFF" w:color="auto" w:val="clear"/>
-            <w:tcMar>
-              <w:top w:type="dxa" w:w="60"/>
-              <w:left w:type="dxa" w:w="100"/>
-              <w:bottom w:type="dxa" w:w="60"/>
-              <w:right w:type="dxa" w:w="100"/>
-            </w:tcMar>
-          </w:tcPr>
-          <w:p>
-            <w:r>
-              <w:rPr>
-                <w:sz w:val="19"/>
-                <w:szCs w:val="19"/>
-              </w:rPr>
-              <w:t xml:space="preserve">10</w:t>
-            </w:r>
-          </w:p>
-        </w:tc>
-        <w:tc>
-          <w:tcPr>
-            <w:tcW w:type="dxa" w:w="3900"/>
-            <w:tcBorders>
-              <w:top w:val="single" w:color="B8C2D0" w:sz="4"/>
-              <w:left w:val="single" w:color="B8C2D0" w:sz="4"/>
-              <w:bottom w:val="single" w:color="B8C2D0" w:sz="4"/>
-              <w:right w:val="single" w:color="B8C2D0" w:sz="4"/>
-            </w:tcBorders>
-            <w:shd w:fill="FFFFFF" w:color="auto" w:val="clear"/>
-            <w:tcMar>
-              <w:top w:type="dxa" w:w="60"/>
-              <w:left w:type="dxa" w:w="100"/>
-              <w:bottom w:type="dxa" w:w="60"/>
-              <w:right w:type="dxa" w:w="100"/>
-            </w:tcMar>
-          </w:tcPr>
-          <w:p>
-            <w:r>
-              <w:rPr>
-                <w:sz w:val="19"/>
-                <w:szCs w:val="19"/>
-              </w:rPr>
-              <w:t xml:space="preserve">No single place for security warnings</w:t>
-            </w:r>
-          </w:p>
-        </w:tc>
-        <w:tc>
-          <w:tcPr>
-            <w:tcW w:type="dxa" w:w="4426"/>
-            <w:tcBorders>
-              <w:top w:val="single" w:color="B8C2D0" w:sz="4"/>
-              <w:left w:val="single" w:color="B8C2D0" w:sz="4"/>
-              <w:bottom w:val="single" w:color="B8C2D0" w:sz="4"/>
-              <w:right w:val="single" w:color="B8C2D0" w:sz="4"/>
-            </w:tcBorders>
-            <w:shd w:fill="FFFFFF" w:color="auto" w:val="clear"/>
-            <w:tcMar>
-              <w:top w:type="dxa" w:w="60"/>
-              <w:left w:type="dxa" w:w="100"/>
-              <w:bottom w:type="dxa" w:w="60"/>
-              <w:right w:type="dxa" w:w="100"/>
-            </w:tcMar>
-          </w:tcPr>
-          <w:p>
-            <w:r>
-              <w:rPr>
-                <w:sz w:val="19"/>
-                <w:szCs w:val="19"/>
-              </w:rPr>
-              <w:t xml:space="preserve">Staff miss news about active threats</w:t>
-            </w:r>
-          </w:p>
-        </w:tc>
-      </w:tr>
     </w:tbl>
     <w:p>
       <w:pPr>
@@ -1445,7 +1351,23 @@
         <w:spacing w:after="120" w:line="300"/>
       </w:pPr>
       <w:r>
-        <w:t xml:space="preserve">The organisation has no single, safe and measurable way to teach staff about cyber threats and to handle security incidents. As a result, staff make avoidable mistakes and incidents are handled slowly and without proof.</w:t>
+        <w:t xml:space="preserve">The organisation has no single, safe and measurable way to teach staff about cyber threats and to handle security incidents. Staff make avoidable mistakes and incidents are handled slowly and without proof.</w:t>
+      </w:r>
+    </w:p>
+    <w:p>
+      <w:pPr>
+        <w:pStyle w:val="Heading1"/>
+      </w:pPr>
+      <w:r>
+        <w:t xml:space="preserve">1.3 Scope</w:t>
+      </w:r>
+    </w:p>
+    <w:p>
+      <w:pPr>
+        <w:spacing w:after="120" w:line="300"/>
+      </w:pPr>
+      <w:r>
+        <w:t xml:space="preserve">The scope covers what the running system does and what it does not do.</w:t>
       </w:r>
     </w:p>
     <w:p>
@@ -1453,7 +1375,7 @@
         <w:pStyle w:val="Heading2"/>
       </w:pPr>
       <w:r>
-        <w:t xml:space="preserve">1.2.5 Stakeholders</w:t>
+        <w:t xml:space="preserve">1.3.1 In scope</w:t>
       </w:r>
     </w:p>
     <w:p>
@@ -1469,7 +1391,7 @@
           <w:sz w:val="19"/>
           <w:szCs w:val="19"/>
         </w:rPr>
-        <w:t xml:space="preserve">Table 1.2: Stakeholders</w:t>
+        <w:t xml:space="preserve">Table 1.2: Items in scope</w:t>
       </w:r>
     </w:p>
     <w:tbl>
@@ -1485,8 +1407,8 @@
         </w:tblBorders>
       </w:tblPr>
       <w:tblGrid>
-        <w:gridCol w:w="3000"/>
-        <w:gridCol w:w="6026"/>
+        <w:gridCol w:w="5200"/>
+        <w:gridCol w:w="3826"/>
       </w:tblGrid>
       <w:tr>
         <w:trPr>
@@ -1494,7 +1416,7 @@
         </w:trPr>
         <w:tc>
           <w:tcPr>
-            <w:tcW w:type="dxa" w:w="3000"/>
+            <w:tcW w:type="dxa" w:w="5200"/>
             <w:tcBorders>
               <w:top w:val="single" w:color="B8C2D0" w:sz="4"/>
               <w:left w:val="single" w:color="B8C2D0" w:sz="4"/>
@@ -1518,13 +1440,13 @@
                 <w:sz w:val="19"/>
                 <w:szCs w:val="19"/>
               </w:rPr>
-              <w:t xml:space="preserve">Stakeholder</w:t>
-            </w:r>
-          </w:p>
-        </w:tc>
-        <w:tc>
-          <w:tcPr>
-            <w:tcW w:type="dxa" w:w="6026"/>
+              <w:t xml:space="preserve">Item</w:t>
+            </w:r>
+          </w:p>
+        </w:tc>
+        <w:tc>
+          <w:tcPr>
+            <w:tcW w:type="dxa" w:w="3826"/>
             <w:tcBorders>
               <w:top w:val="single" w:color="B8C2D0" w:sz="4"/>
               <w:left w:val="single" w:color="B8C2D0" w:sz="4"/>
@@ -1548,7 +1470,7 @@
                 <w:sz w:val="19"/>
                 <w:szCs w:val="19"/>
               </w:rPr>
-              <w:t xml:space="preserve">Interest in the system</w:t>
+              <w:t xml:space="preserve">Reason</w:t>
             </w:r>
           </w:p>
         </w:tc>
@@ -1559,55 +1481,55 @@
         </w:trPr>
         <w:tc>
           <w:tcPr>
-            <w:tcW w:type="dxa" w:w="3000"/>
-            <w:tcBorders>
-              <w:top w:val="single" w:color="B8C2D0" w:sz="4"/>
-              <w:left w:val="single" w:color="B8C2D0" w:sz="4"/>
-              <w:bottom w:val="single" w:color="B8C2D0" w:sz="4"/>
-              <w:right w:val="single" w:color="B8C2D0" w:sz="4"/>
-            </w:tcBorders>
-            <w:shd w:fill="FFFFFF" w:color="auto" w:val="clear"/>
-            <w:tcMar>
-              <w:top w:type="dxa" w:w="60"/>
-              <w:left w:type="dxa" w:w="100"/>
-              <w:bottom w:type="dxa" w:w="60"/>
-              <w:right w:type="dxa" w:w="100"/>
-            </w:tcMar>
-          </w:tcPr>
-          <w:p>
-            <w:r>
-              <w:rPr>
-                <w:sz w:val="19"/>
-                <w:szCs w:val="19"/>
-              </w:rPr>
-              <w:t xml:space="preserve">Staff (normal users)</w:t>
-            </w:r>
-          </w:p>
-        </w:tc>
-        <w:tc>
-          <w:tcPr>
-            <w:tcW w:type="dxa" w:w="6026"/>
-            <w:tcBorders>
-              <w:top w:val="single" w:color="B8C2D0" w:sz="4"/>
-              <w:left w:val="single" w:color="B8C2D0" w:sz="4"/>
-              <w:bottom w:val="single" w:color="B8C2D0" w:sz="4"/>
-              <w:right w:val="single" w:color="B8C2D0" w:sz="4"/>
-            </w:tcBorders>
-            <w:shd w:fill="FFFFFF" w:color="auto" w:val="clear"/>
-            <w:tcMar>
-              <w:top w:type="dxa" w:w="60"/>
-              <w:left w:type="dxa" w:w="100"/>
-              <w:bottom w:type="dxa" w:w="60"/>
-              <w:right w:type="dxa" w:w="100"/>
-            </w:tcMar>
-          </w:tcPr>
-          <w:p>
-            <w:r>
-              <w:rPr>
-                <w:sz w:val="19"/>
-                <w:szCs w:val="19"/>
-              </w:rPr>
-              <w:t xml:space="preserve">Learn about threats, test themselves and report problems easily</w:t>
+            <w:tcW w:type="dxa" w:w="5200"/>
+            <w:tcBorders>
+              <w:top w:val="single" w:color="B8C2D0" w:sz="4"/>
+              <w:left w:val="single" w:color="B8C2D0" w:sz="4"/>
+              <w:bottom w:val="single" w:color="B8C2D0" w:sz="4"/>
+              <w:right w:val="single" w:color="B8C2D0" w:sz="4"/>
+            </w:tcBorders>
+            <w:shd w:fill="FFFFFF" w:color="auto" w:val="clear"/>
+            <w:tcMar>
+              <w:top w:type="dxa" w:w="60"/>
+              <w:left w:type="dxa" w:w="100"/>
+              <w:bottom w:type="dxa" w:w="60"/>
+              <w:right w:type="dxa" w:w="100"/>
+            </w:tcMar>
+          </w:tcPr>
+          <w:p>
+            <w:r>
+              <w:rPr>
+                <w:sz w:val="19"/>
+                <w:szCs w:val="19"/>
+              </w:rPr>
+              <w:t xml:space="preserve">Registration, login and logout with tokens (JWT), password reset, e-mail verification, session control</w:t>
+            </w:r>
+          </w:p>
+        </w:tc>
+        <w:tc>
+          <w:tcPr>
+            <w:tcW w:type="dxa" w:w="3826"/>
+            <w:tcBorders>
+              <w:top w:val="single" w:color="B8C2D0" w:sz="4"/>
+              <w:left w:val="single" w:color="B8C2D0" w:sz="4"/>
+              <w:bottom w:val="single" w:color="B8C2D0" w:sz="4"/>
+              <w:right w:val="single" w:color="B8C2D0" w:sz="4"/>
+            </w:tcBorders>
+            <w:shd w:fill="FFFFFF" w:color="auto" w:val="clear"/>
+            <w:tcMar>
+              <w:top w:type="dxa" w:w="60"/>
+              <w:left w:type="dxa" w:w="100"/>
+              <w:bottom w:type="dxa" w:w="60"/>
+              <w:right w:type="dxa" w:w="100"/>
+            </w:tcMar>
+          </w:tcPr>
+          <w:p>
+            <w:r>
+              <w:rPr>
+                <w:sz w:val="19"/>
+                <w:szCs w:val="19"/>
+              </w:rPr>
+              <w:t xml:space="preserve">Every other feature needs to know who the user is</w:t>
             </w:r>
           </w:p>
         </w:tc>
@@ -1618,55 +1540,55 @@
         </w:trPr>
         <w:tc>
           <w:tcPr>
-            <w:tcW w:type="dxa" w:w="3000"/>
-            <w:tcBorders>
-              <w:top w:val="single" w:color="B8C2D0" w:sz="4"/>
-              <w:left w:val="single" w:color="B8C2D0" w:sz="4"/>
-              <w:bottom w:val="single" w:color="B8C2D0" w:sz="4"/>
-              <w:right w:val="single" w:color="B8C2D0" w:sz="4"/>
-            </w:tcBorders>
-            <w:shd w:fill="FFFFFF" w:color="auto" w:val="clear"/>
-            <w:tcMar>
-              <w:top w:type="dxa" w:w="60"/>
-              <w:left w:type="dxa" w:w="100"/>
-              <w:bottom w:type="dxa" w:w="60"/>
-              <w:right w:type="dxa" w:w="100"/>
-            </w:tcMar>
-          </w:tcPr>
-          <w:p>
-            <w:r>
-              <w:rPr>
-                <w:sz w:val="19"/>
-                <w:szCs w:val="19"/>
-              </w:rPr>
-              <w:t xml:space="preserve">Cybersecurity officers</w:t>
-            </w:r>
-          </w:p>
-        </w:tc>
-        <w:tc>
-          <w:tcPr>
-            <w:tcW w:type="dxa" w:w="6026"/>
-            <w:tcBorders>
-              <w:top w:val="single" w:color="B8C2D0" w:sz="4"/>
-              <w:left w:val="single" w:color="B8C2D0" w:sz="4"/>
-              <w:bottom w:val="single" w:color="B8C2D0" w:sz="4"/>
-              <w:right w:val="single" w:color="B8C2D0" w:sz="4"/>
-            </w:tcBorders>
-            <w:shd w:fill="FFFFFF" w:color="auto" w:val="clear"/>
-            <w:tcMar>
-              <w:top w:type="dxa" w:w="60"/>
-              <w:left w:type="dxa" w:w="100"/>
-              <w:bottom w:type="dxa" w:w="60"/>
-              <w:right w:type="dxa" w:w="100"/>
-            </w:tcMar>
-          </w:tcPr>
-          <w:p>
-            <w:r>
-              <w:rPr>
-                <w:sz w:val="19"/>
-                <w:szCs w:val="19"/>
-              </w:rPr>
-              <w:t xml:space="preserve">Receive clear reports and manage them to closure</w:t>
+            <w:tcW w:type="dxa" w:w="5200"/>
+            <w:tcBorders>
+              <w:top w:val="single" w:color="B8C2D0" w:sz="4"/>
+              <w:left w:val="single" w:color="B8C2D0" w:sz="4"/>
+              <w:bottom w:val="single" w:color="B8C2D0" w:sz="4"/>
+              <w:right w:val="single" w:color="B8C2D0" w:sz="4"/>
+            </w:tcBorders>
+            <w:shd w:fill="FFFFFF" w:color="auto" w:val="clear"/>
+            <w:tcMar>
+              <w:top w:type="dxa" w:w="60"/>
+              <w:left w:type="dxa" w:w="100"/>
+              <w:bottom w:type="dxa" w:w="60"/>
+              <w:right w:type="dxa" w:w="100"/>
+            </w:tcMar>
+          </w:tcPr>
+          <w:p>
+            <w:r>
+              <w:rPr>
+                <w:sz w:val="19"/>
+                <w:szCs w:val="19"/>
+              </w:rPr>
+              <w:t xml:space="preserve">Two roles: normal user and system administrator</w:t>
+            </w:r>
+          </w:p>
+        </w:tc>
+        <w:tc>
+          <w:tcPr>
+            <w:tcW w:type="dxa" w:w="3826"/>
+            <w:tcBorders>
+              <w:top w:val="single" w:color="B8C2D0" w:sz="4"/>
+              <w:left w:val="single" w:color="B8C2D0" w:sz="4"/>
+              <w:bottom w:val="single" w:color="B8C2D0" w:sz="4"/>
+              <w:right w:val="single" w:color="B8C2D0" w:sz="4"/>
+            </w:tcBorders>
+            <w:shd w:fill="FFFFFF" w:color="auto" w:val="clear"/>
+            <w:tcMar>
+              <w:top w:type="dxa" w:w="60"/>
+              <w:left w:type="dxa" w:w="100"/>
+              <w:bottom w:type="dxa" w:w="60"/>
+              <w:right w:type="dxa" w:w="100"/>
+            </w:tcMar>
+          </w:tcPr>
+          <w:p>
+            <w:r>
+              <w:rPr>
+                <w:sz w:val="19"/>
+                <w:szCs w:val="19"/>
+              </w:rPr>
+              <w:t xml:space="preserve">Each person has only the power they need</w:t>
             </w:r>
           </w:p>
         </w:tc>
@@ -1677,55 +1599,55 @@
         </w:trPr>
         <w:tc>
           <w:tcPr>
-            <w:tcW w:type="dxa" w:w="3000"/>
-            <w:tcBorders>
-              <w:top w:val="single" w:color="B8C2D0" w:sz="4"/>
-              <w:left w:val="single" w:color="B8C2D0" w:sz="4"/>
-              <w:bottom w:val="single" w:color="B8C2D0" w:sz="4"/>
-              <w:right w:val="single" w:color="B8C2D0" w:sz="4"/>
-            </w:tcBorders>
-            <w:shd w:fill="FFFFFF" w:color="auto" w:val="clear"/>
-            <w:tcMar>
-              <w:top w:type="dxa" w:w="60"/>
-              <w:left w:type="dxa" w:w="100"/>
-              <w:bottom w:type="dxa" w:w="60"/>
-              <w:right w:type="dxa" w:w="100"/>
-            </w:tcMar>
-          </w:tcPr>
-          <w:p>
-            <w:r>
-              <w:rPr>
-                <w:sz w:val="19"/>
-                <w:szCs w:val="19"/>
-              </w:rPr>
-              <w:t xml:space="preserve">System administrators</w:t>
-            </w:r>
-          </w:p>
-        </w:tc>
-        <w:tc>
-          <w:tcPr>
-            <w:tcW w:type="dxa" w:w="6026"/>
-            <w:tcBorders>
-              <w:top w:val="single" w:color="B8C2D0" w:sz="4"/>
-              <w:left w:val="single" w:color="B8C2D0" w:sz="4"/>
-              <w:bottom w:val="single" w:color="B8C2D0" w:sz="4"/>
-              <w:right w:val="single" w:color="B8C2D0" w:sz="4"/>
-            </w:tcBorders>
-            <w:shd w:fill="FFFFFF" w:color="auto" w:val="clear"/>
-            <w:tcMar>
-              <w:top w:type="dxa" w:w="60"/>
-              <w:left w:type="dxa" w:w="100"/>
-              <w:bottom w:type="dxa" w:w="60"/>
-              <w:right w:type="dxa" w:w="100"/>
-            </w:tcMar>
-          </w:tcPr>
-          <w:p>
-            <w:r>
-              <w:rPr>
-                <w:sz w:val="19"/>
-                <w:szCs w:val="19"/>
-              </w:rPr>
-              <w:t xml:space="preserve">Manage accounts, content and alerts; keep the system safe</w:t>
+            <w:tcW w:type="dxa" w:w="5200"/>
+            <w:tcBorders>
+              <w:top w:val="single" w:color="B8C2D0" w:sz="4"/>
+              <w:left w:val="single" w:color="B8C2D0" w:sz="4"/>
+              <w:bottom w:val="single" w:color="B8C2D0" w:sz="4"/>
+              <w:right w:val="single" w:color="B8C2D0" w:sz="4"/>
+            </w:tcBorders>
+            <w:shd w:fill="FFFFFF" w:color="auto" w:val="clear"/>
+            <w:tcMar>
+              <w:top w:type="dxa" w:w="60"/>
+              <w:left w:type="dxa" w:w="100"/>
+              <w:bottom w:type="dxa" w:w="60"/>
+              <w:right w:type="dxa" w:w="100"/>
+            </w:tcMar>
+          </w:tcPr>
+          <w:p>
+            <w:r>
+              <w:rPr>
+                <w:sz w:val="19"/>
+                <w:szCs w:val="19"/>
+              </w:rPr>
+              <w:t xml:space="preserve">Training library: categories, lessons, difficulty, tags, progress, bookmarks, recommendations</w:t>
+            </w:r>
+          </w:p>
+        </w:tc>
+        <w:tc>
+          <w:tcPr>
+            <w:tcW w:type="dxa" w:w="3826"/>
+            <w:tcBorders>
+              <w:top w:val="single" w:color="B8C2D0" w:sz="4"/>
+              <w:left w:val="single" w:color="B8C2D0" w:sz="4"/>
+              <w:bottom w:val="single" w:color="B8C2D0" w:sz="4"/>
+              <w:right w:val="single" w:color="B8C2D0" w:sz="4"/>
+            </w:tcBorders>
+            <w:shd w:fill="FFFFFF" w:color="auto" w:val="clear"/>
+            <w:tcMar>
+              <w:top w:type="dxa" w:w="60"/>
+              <w:left w:type="dxa" w:w="100"/>
+              <w:bottom w:type="dxa" w:w="60"/>
+              <w:right w:type="dxa" w:w="100"/>
+            </w:tcMar>
+          </w:tcPr>
+          <w:p>
+            <w:r>
+              <w:rPr>
+                <w:sz w:val="19"/>
+                <w:szCs w:val="19"/>
+              </w:rPr>
+              <w:t xml:space="preserve">This is the learning content</w:t>
             </w:r>
           </w:p>
         </w:tc>
@@ -1736,55 +1658,55 @@
         </w:trPr>
         <w:tc>
           <w:tcPr>
-            <w:tcW w:type="dxa" w:w="3000"/>
-            <w:tcBorders>
-              <w:top w:val="single" w:color="B8C2D0" w:sz="4"/>
-              <w:left w:val="single" w:color="B8C2D0" w:sz="4"/>
-              <w:bottom w:val="single" w:color="B8C2D0" w:sz="4"/>
-              <w:right w:val="single" w:color="B8C2D0" w:sz="4"/>
-            </w:tcBorders>
-            <w:shd w:fill="FFFFFF" w:color="auto" w:val="clear"/>
-            <w:tcMar>
-              <w:top w:type="dxa" w:w="60"/>
-              <w:left w:type="dxa" w:w="100"/>
-              <w:bottom w:type="dxa" w:w="60"/>
-              <w:right w:type="dxa" w:w="100"/>
-            </w:tcMar>
-          </w:tcPr>
-          <w:p>
-            <w:r>
-              <w:rPr>
-                <w:sz w:val="19"/>
-                <w:szCs w:val="19"/>
-              </w:rPr>
-              <w:t xml:space="preserve">Management</w:t>
-            </w:r>
-          </w:p>
-        </w:tc>
-        <w:tc>
-          <w:tcPr>
-            <w:tcW w:type="dxa" w:w="6026"/>
-            <w:tcBorders>
-              <w:top w:val="single" w:color="B8C2D0" w:sz="4"/>
-              <w:left w:val="single" w:color="B8C2D0" w:sz="4"/>
-              <w:bottom w:val="single" w:color="B8C2D0" w:sz="4"/>
-              <w:right w:val="single" w:color="B8C2D0" w:sz="4"/>
-            </w:tcBorders>
-            <w:shd w:fill="FFFFFF" w:color="auto" w:val="clear"/>
-            <w:tcMar>
-              <w:top w:type="dxa" w:w="60"/>
-              <w:left w:type="dxa" w:w="100"/>
-              <w:bottom w:type="dxa" w:w="60"/>
-              <w:right w:type="dxa" w:w="100"/>
-            </w:tcMar>
-          </w:tcPr>
-          <w:p>
-            <w:r>
-              <w:rPr>
-                <w:sz w:val="19"/>
-                <w:szCs w:val="19"/>
-              </w:rPr>
-              <w:t xml:space="preserve">See measurable results and reduced risk</w:t>
+            <w:tcW w:type="dxa" w:w="5200"/>
+            <w:tcBorders>
+              <w:top w:val="single" w:color="B8C2D0" w:sz="4"/>
+              <w:left w:val="single" w:color="B8C2D0" w:sz="4"/>
+              <w:bottom w:val="single" w:color="B8C2D0" w:sz="4"/>
+              <w:right w:val="single" w:color="B8C2D0" w:sz="4"/>
+            </w:tcBorders>
+            <w:shd w:fill="FFFFFF" w:color="auto" w:val="clear"/>
+            <w:tcMar>
+              <w:top w:type="dxa" w:w="60"/>
+              <w:left w:type="dxa" w:w="100"/>
+              <w:bottom w:type="dxa" w:w="60"/>
+              <w:right w:type="dxa" w:w="100"/>
+            </w:tcMar>
+          </w:tcPr>
+          <w:p>
+            <w:r>
+              <w:rPr>
+                <w:sz w:val="19"/>
+                <w:szCs w:val="19"/>
+              </w:rPr>
+              <w:t xml:space="preserve">Quizzes: timed multiple-choice, scoring, pass mark, attempt limits, weak-topic analysis</w:t>
+            </w:r>
+          </w:p>
+        </w:tc>
+        <w:tc>
+          <w:tcPr>
+            <w:tcW w:type="dxa" w:w="3826"/>
+            <w:tcBorders>
+              <w:top w:val="single" w:color="B8C2D0" w:sz="4"/>
+              <w:left w:val="single" w:color="B8C2D0" w:sz="4"/>
+              <w:bottom w:val="single" w:color="B8C2D0" w:sz="4"/>
+              <w:right w:val="single" w:color="B8C2D0" w:sz="4"/>
+            </w:tcBorders>
+            <w:shd w:fill="FFFFFF" w:color="auto" w:val="clear"/>
+            <w:tcMar>
+              <w:top w:type="dxa" w:w="60"/>
+              <w:left w:type="dxa" w:w="100"/>
+              <w:bottom w:type="dxa" w:w="60"/>
+              <w:right w:type="dxa" w:w="100"/>
+            </w:tcMar>
+          </w:tcPr>
+          <w:p>
+            <w:r>
+              <w:rPr>
+                <w:sz w:val="19"/>
+                <w:szCs w:val="19"/>
+              </w:rPr>
+              <w:t xml:space="preserve">Quizzes measure what staff learned</w:t>
             </w:r>
           </w:p>
         </w:tc>
@@ -1795,55 +1717,350 @@
         </w:trPr>
         <w:tc>
           <w:tcPr>
-            <w:tcW w:type="dxa" w:w="3000"/>
-            <w:tcBorders>
-              <w:top w:val="single" w:color="B8C2D0" w:sz="4"/>
-              <w:left w:val="single" w:color="B8C2D0" w:sz="4"/>
-              <w:bottom w:val="single" w:color="B8C2D0" w:sz="4"/>
-              <w:right w:val="single" w:color="B8C2D0" w:sz="4"/>
-            </w:tcBorders>
-            <w:shd w:fill="FFFFFF" w:color="auto" w:val="clear"/>
-            <w:tcMar>
-              <w:top w:type="dxa" w:w="60"/>
-              <w:left w:type="dxa" w:w="100"/>
-              <w:bottom w:type="dxa" w:w="60"/>
-              <w:right w:type="dxa" w:w="100"/>
-            </w:tcMar>
-          </w:tcPr>
-          <w:p>
-            <w:r>
-              <w:rPr>
-                <w:sz w:val="19"/>
-                <w:szCs w:val="19"/>
-              </w:rPr>
-              <w:t xml:space="preserve">Supervisor and examiners</w:t>
-            </w:r>
-          </w:p>
-        </w:tc>
-        <w:tc>
-          <w:tcPr>
-            <w:tcW w:type="dxa" w:w="6026"/>
-            <w:tcBorders>
-              <w:top w:val="single" w:color="B8C2D0" w:sz="4"/>
-              <w:left w:val="single" w:color="B8C2D0" w:sz="4"/>
-              <w:bottom w:val="single" w:color="B8C2D0" w:sz="4"/>
-              <w:right w:val="single" w:color="B8C2D0" w:sz="4"/>
-            </w:tcBorders>
-            <w:shd w:fill="FFFFFF" w:color="auto" w:val="clear"/>
-            <w:tcMar>
-              <w:top w:type="dxa" w:w="60"/>
-              <w:left w:type="dxa" w:w="100"/>
-              <w:bottom w:type="dxa" w:w="60"/>
-              <w:right w:type="dxa" w:w="100"/>
-            </w:tcMar>
-          </w:tcPr>
-          <w:p>
-            <w:r>
-              <w:rPr>
-                <w:sz w:val="19"/>
-                <w:szCs w:val="19"/>
-              </w:rPr>
-              <w:t xml:space="preserve">Judge the quality of the project</w:t>
+            <w:tcW w:type="dxa" w:w="5200"/>
+            <w:tcBorders>
+              <w:top w:val="single" w:color="B8C2D0" w:sz="4"/>
+              <w:left w:val="single" w:color="B8C2D0" w:sz="4"/>
+              <w:bottom w:val="single" w:color="B8C2D0" w:sz="4"/>
+              <w:right w:val="single" w:color="B8C2D0" w:sz="4"/>
+            </w:tcBorders>
+            <w:shd w:fill="FFFFFF" w:color="auto" w:val="clear"/>
+            <w:tcMar>
+              <w:top w:type="dxa" w:w="60"/>
+              <w:left w:type="dxa" w:w="100"/>
+              <w:bottom w:type="dxa" w:w="60"/>
+              <w:right w:type="dxa" w:w="100"/>
+            </w:tcMar>
+          </w:tcPr>
+          <w:p>
+            <w:r>
+              <w:rPr>
+                <w:sz w:val="19"/>
+                <w:szCs w:val="19"/>
+              </w:rPr>
+              <w:t xml:space="preserve">Phishing simulator: inbox scenarios, link inspection, red-flag choice, scored feedback</w:t>
+            </w:r>
+          </w:p>
+        </w:tc>
+        <w:tc>
+          <w:tcPr>
+            <w:tcW w:type="dxa" w:w="3826"/>
+            <w:tcBorders>
+              <w:top w:val="single" w:color="B8C2D0" w:sz="4"/>
+              <w:left w:val="single" w:color="B8C2D0" w:sz="4"/>
+              <w:bottom w:val="single" w:color="B8C2D0" w:sz="4"/>
+              <w:right w:val="single" w:color="B8C2D0" w:sz="4"/>
+            </w:tcBorders>
+            <w:shd w:fill="FFFFFF" w:color="auto" w:val="clear"/>
+            <w:tcMar>
+              <w:top w:type="dxa" w:w="60"/>
+              <w:left w:type="dxa" w:w="100"/>
+              <w:bottom w:type="dxa" w:w="60"/>
+              <w:right w:type="dxa" w:w="100"/>
+            </w:tcMar>
+          </w:tcPr>
+          <w:p>
+            <w:r>
+              <w:rPr>
+                <w:sz w:val="19"/>
+                <w:szCs w:val="19"/>
+              </w:rPr>
+              <w:t xml:space="preserve">Staff practise in a safe place</w:t>
+            </w:r>
+          </w:p>
+        </w:tc>
+      </w:tr>
+      <w:tr>
+        <w:trPr>
+          <w:cantSplit/>
+        </w:trPr>
+        <w:tc>
+          <w:tcPr>
+            <w:tcW w:type="dxa" w:w="5200"/>
+            <w:tcBorders>
+              <w:top w:val="single" w:color="B8C2D0" w:sz="4"/>
+              <w:left w:val="single" w:color="B8C2D0" w:sz="4"/>
+              <w:bottom w:val="single" w:color="B8C2D0" w:sz="4"/>
+              <w:right w:val="single" w:color="B8C2D0" w:sz="4"/>
+            </w:tcBorders>
+            <w:shd w:fill="FFFFFF" w:color="auto" w:val="clear"/>
+            <w:tcMar>
+              <w:top w:type="dxa" w:w="60"/>
+              <w:left w:type="dxa" w:w="100"/>
+              <w:bottom w:type="dxa" w:w="60"/>
+              <w:right w:type="dxa" w:w="100"/>
+            </w:tcMar>
+          </w:tcPr>
+          <w:p>
+            <w:r>
+              <w:rPr>
+                <w:sz w:val="19"/>
+                <w:szCs w:val="19"/>
+              </w:rPr>
+              <w:t xml:space="preserve">Incident reporting: evidence upload, drafts, reference numbers</w:t>
+            </w:r>
+          </w:p>
+        </w:tc>
+        <w:tc>
+          <w:tcPr>
+            <w:tcW w:type="dxa" w:w="3826"/>
+            <w:tcBorders>
+              <w:top w:val="single" w:color="B8C2D0" w:sz="4"/>
+              <w:left w:val="single" w:color="B8C2D0" w:sz="4"/>
+              <w:bottom w:val="single" w:color="B8C2D0" w:sz="4"/>
+              <w:right w:val="single" w:color="B8C2D0" w:sz="4"/>
+            </w:tcBorders>
+            <w:shd w:fill="FFFFFF" w:color="auto" w:val="clear"/>
+            <w:tcMar>
+              <w:top w:type="dxa" w:w="60"/>
+              <w:left w:type="dxa" w:w="100"/>
+              <w:bottom w:type="dxa" w:w="60"/>
+              <w:right w:type="dxa" w:w="100"/>
+            </w:tcMar>
+          </w:tcPr>
+          <w:p>
+            <w:r>
+              <w:rPr>
+                <w:sz w:val="19"/>
+                <w:szCs w:val="19"/>
+              </w:rPr>
+              <w:t xml:space="preserve">Reports follow one format</w:t>
+            </w:r>
+          </w:p>
+        </w:tc>
+      </w:tr>
+      <w:tr>
+        <w:trPr>
+          <w:cantSplit/>
+        </w:trPr>
+        <w:tc>
+          <w:tcPr>
+            <w:tcW w:type="dxa" w:w="5200"/>
+            <w:tcBorders>
+              <w:top w:val="single" w:color="B8C2D0" w:sz="4"/>
+              <w:left w:val="single" w:color="B8C2D0" w:sz="4"/>
+              <w:bottom w:val="single" w:color="B8C2D0" w:sz="4"/>
+              <w:right w:val="single" w:color="B8C2D0" w:sz="4"/>
+            </w:tcBorders>
+            <w:shd w:fill="FFFFFF" w:color="auto" w:val="clear"/>
+            <w:tcMar>
+              <w:top w:type="dxa" w:w="60"/>
+              <w:left w:type="dxa" w:w="100"/>
+              <w:bottom w:type="dxa" w:w="60"/>
+              <w:right w:type="dxa" w:w="100"/>
+            </w:tcMar>
+          </w:tcPr>
+          <w:p>
+            <w:r>
+              <w:rPr>
+                <w:sz w:val="19"/>
+                <w:szCs w:val="19"/>
+              </w:rPr>
+              <w:t xml:space="preserve">SOC queue: board of columns, assignment, escalation, status flow, timeline</w:t>
+            </w:r>
+          </w:p>
+        </w:tc>
+        <w:tc>
+          <w:tcPr>
+            <w:tcW w:type="dxa" w:w="3826"/>
+            <w:tcBorders>
+              <w:top w:val="single" w:color="B8C2D0" w:sz="4"/>
+              <w:left w:val="single" w:color="B8C2D0" w:sz="4"/>
+              <w:bottom w:val="single" w:color="B8C2D0" w:sz="4"/>
+              <w:right w:val="single" w:color="B8C2D0" w:sz="4"/>
+            </w:tcBorders>
+            <w:shd w:fill="FFFFFF" w:color="auto" w:val="clear"/>
+            <w:tcMar>
+              <w:top w:type="dxa" w:w="60"/>
+              <w:left w:type="dxa" w:w="100"/>
+              <w:bottom w:type="dxa" w:w="60"/>
+              <w:right w:type="dxa" w:w="100"/>
+            </w:tcMar>
+          </w:tcPr>
+          <w:p>
+            <w:r>
+              <w:rPr>
+                <w:sz w:val="19"/>
+                <w:szCs w:val="19"/>
+              </w:rPr>
+              <w:t xml:space="preserve">Every case is tracked to closure</w:t>
+            </w:r>
+          </w:p>
+        </w:tc>
+      </w:tr>
+      <w:tr>
+        <w:trPr>
+          <w:cantSplit/>
+        </w:trPr>
+        <w:tc>
+          <w:tcPr>
+            <w:tcW w:type="dxa" w:w="5200"/>
+            <w:tcBorders>
+              <w:top w:val="single" w:color="B8C2D0" w:sz="4"/>
+              <w:left w:val="single" w:color="B8C2D0" w:sz="4"/>
+              <w:bottom w:val="single" w:color="B8C2D0" w:sz="4"/>
+              <w:right w:val="single" w:color="B8C2D0" w:sz="4"/>
+            </w:tcBorders>
+            <w:shd w:fill="FFFFFF" w:color="auto" w:val="clear"/>
+            <w:tcMar>
+              <w:top w:type="dxa" w:w="60"/>
+              <w:left w:type="dxa" w:w="100"/>
+              <w:bottom w:type="dxa" w:w="60"/>
+              <w:right w:type="dxa" w:w="100"/>
+            </w:tcMar>
+          </w:tcPr>
+          <w:p>
+            <w:r>
+              <w:rPr>
+                <w:sz w:val="19"/>
+                <w:szCs w:val="19"/>
+              </w:rPr>
+              <w:t xml:space="preserve">Analytics dashboards for one user and for the organisation</w:t>
+            </w:r>
+          </w:p>
+        </w:tc>
+        <w:tc>
+          <w:tcPr>
+            <w:tcW w:type="dxa" w:w="3826"/>
+            <w:tcBorders>
+              <w:top w:val="single" w:color="B8C2D0" w:sz="4"/>
+              <w:left w:val="single" w:color="B8C2D0" w:sz="4"/>
+              <w:bottom w:val="single" w:color="B8C2D0" w:sz="4"/>
+              <w:right w:val="single" w:color="B8C2D0" w:sz="4"/>
+            </w:tcBorders>
+            <w:shd w:fill="FFFFFF" w:color="auto" w:val="clear"/>
+            <w:tcMar>
+              <w:top w:type="dxa" w:w="60"/>
+              <w:left w:type="dxa" w:w="100"/>
+              <w:bottom w:type="dxa" w:w="60"/>
+              <w:right w:type="dxa" w:w="100"/>
+            </w:tcMar>
+          </w:tcPr>
+          <w:p>
+            <w:r>
+              <w:rPr>
+                <w:sz w:val="19"/>
+                <w:szCs w:val="19"/>
+              </w:rPr>
+              <w:t xml:space="preserve">Management sees clear numbers</w:t>
+            </w:r>
+          </w:p>
+        </w:tc>
+      </w:tr>
+      <w:tr>
+        <w:trPr>
+          <w:cantSplit/>
+        </w:trPr>
+        <w:tc>
+          <w:tcPr>
+            <w:tcW w:type="dxa" w:w="5200"/>
+            <w:tcBorders>
+              <w:top w:val="single" w:color="B8C2D0" w:sz="4"/>
+              <w:left w:val="single" w:color="B8C2D0" w:sz="4"/>
+              <w:bottom w:val="single" w:color="B8C2D0" w:sz="4"/>
+              <w:right w:val="single" w:color="B8C2D0" w:sz="4"/>
+            </w:tcBorders>
+            <w:shd w:fill="FFFFFF" w:color="auto" w:val="clear"/>
+            <w:tcMar>
+              <w:top w:type="dxa" w:w="60"/>
+              <w:left w:type="dxa" w:w="100"/>
+              <w:bottom w:type="dxa" w:w="60"/>
+              <w:right w:type="dxa" w:w="100"/>
+            </w:tcMar>
+          </w:tcPr>
+          <w:p>
+            <w:r>
+              <w:rPr>
+                <w:sz w:val="19"/>
+                <w:szCs w:val="19"/>
+              </w:rPr>
+              <w:t xml:space="preserve">Audit log with filters and CSV export</w:t>
+            </w:r>
+          </w:p>
+        </w:tc>
+        <w:tc>
+          <w:tcPr>
+            <w:tcW w:type="dxa" w:w="3826"/>
+            <w:tcBorders>
+              <w:top w:val="single" w:color="B8C2D0" w:sz="4"/>
+              <w:left w:val="single" w:color="B8C2D0" w:sz="4"/>
+              <w:bottom w:val="single" w:color="B8C2D0" w:sz="4"/>
+              <w:right w:val="single" w:color="B8C2D0" w:sz="4"/>
+            </w:tcBorders>
+            <w:shd w:fill="FFFFFF" w:color="auto" w:val="clear"/>
+            <w:tcMar>
+              <w:top w:type="dxa" w:w="60"/>
+              <w:left w:type="dxa" w:w="100"/>
+              <w:bottom w:type="dxa" w:w="60"/>
+              <w:right w:type="dxa" w:w="100"/>
+            </w:tcMar>
+          </w:tcPr>
+          <w:p>
+            <w:r>
+              <w:rPr>
+                <w:sz w:val="19"/>
+                <w:szCs w:val="19"/>
+              </w:rPr>
+              <w:t xml:space="preserve">Every change is on record</w:t>
+            </w:r>
+          </w:p>
+        </w:tc>
+      </w:tr>
+      <w:tr>
+        <w:trPr>
+          <w:cantSplit/>
+        </w:trPr>
+        <w:tc>
+          <w:tcPr>
+            <w:tcW w:type="dxa" w:w="5200"/>
+            <w:tcBorders>
+              <w:top w:val="single" w:color="B8C2D0" w:sz="4"/>
+              <w:left w:val="single" w:color="B8C2D0" w:sz="4"/>
+              <w:bottom w:val="single" w:color="B8C2D0" w:sz="4"/>
+              <w:right w:val="single" w:color="B8C2D0" w:sz="4"/>
+            </w:tcBorders>
+            <w:shd w:fill="FFFFFF" w:color="auto" w:val="clear"/>
+            <w:tcMar>
+              <w:top w:type="dxa" w:w="60"/>
+              <w:left w:type="dxa" w:w="100"/>
+              <w:bottom w:type="dxa" w:w="60"/>
+              <w:right w:type="dxa" w:w="100"/>
+            </w:tcMar>
+          </w:tcPr>
+          <w:p>
+            <w:r>
+              <w:rPr>
+                <w:sz w:val="19"/>
+                <w:szCs w:val="19"/>
+              </w:rPr>
+              <w:t xml:space="preserve">Admin tools for lessons, quizzes, simulations, categories, quiz settings and users</w:t>
+            </w:r>
+          </w:p>
+        </w:tc>
+        <w:tc>
+          <w:tcPr>
+            <w:tcW w:type="dxa" w:w="3826"/>
+            <w:tcBorders>
+              <w:top w:val="single" w:color="B8C2D0" w:sz="4"/>
+              <w:left w:val="single" w:color="B8C2D0" w:sz="4"/>
+              <w:bottom w:val="single" w:color="B8C2D0" w:sz="4"/>
+              <w:right w:val="single" w:color="B8C2D0" w:sz="4"/>
+            </w:tcBorders>
+            <w:shd w:fill="FFFFFF" w:color="auto" w:val="clear"/>
+            <w:tcMar>
+              <w:top w:type="dxa" w:w="60"/>
+              <w:left w:type="dxa" w:w="100"/>
+              <w:bottom w:type="dxa" w:w="60"/>
+              <w:right w:type="dxa" w:w="100"/>
+            </w:tcMar>
+          </w:tcPr>
+          <w:p>
+            <w:r>
+              <w:rPr>
+                <w:sz w:val="19"/>
+                <w:szCs w:val="19"/>
+              </w:rPr>
+              <w:t xml:space="preserve">Content is updated without a programmer</w:t>
             </w:r>
           </w:p>
         </w:tc>
@@ -1856,26 +2073,10 @@
     </w:p>
     <w:p>
       <w:pPr>
-        <w:pStyle w:val="Heading1"/>
-      </w:pPr>
-      <w:r>
-        <w:t xml:space="preserve">1.3 Scope</w:t>
-      </w:r>
-    </w:p>
-    <w:p>
-      <w:pPr>
-        <w:spacing w:after="120" w:line="300"/>
-      </w:pPr>
-      <w:r>
-        <w:t xml:space="preserve">The scope says what the project will do and what it will not do, and gives a reason for each.</w:t>
-      </w:r>
-    </w:p>
-    <w:p>
-      <w:pPr>
         <w:pStyle w:val="Heading2"/>
       </w:pPr>
       <w:r>
-        <w:t xml:space="preserve">1.3.1 What is in scope</w:t>
+        <w:t xml:space="preserve">1.3.2 Out of scope</w:t>
       </w:r>
     </w:p>
     <w:p>
@@ -1891,7 +2092,7 @@
           <w:sz w:val="19"/>
           <w:szCs w:val="19"/>
         </w:rPr>
-        <w:t xml:space="preserve">Table 1.3: Items in scope</w:t>
+        <w:t xml:space="preserve">Table 1.3: Items out of scope</w:t>
       </w:r>
     </w:p>
     <w:tbl>
@@ -1907,8 +2108,8 @@
         </w:tblBorders>
       </w:tblPr>
       <w:tblGrid>
-        <w:gridCol w:w="5000"/>
-        <w:gridCol w:w="4026"/>
+        <w:gridCol w:w="5200"/>
+        <w:gridCol w:w="3826"/>
       </w:tblGrid>
       <w:tr>
         <w:trPr>
@@ -1916,7 +2117,7 @@
         </w:trPr>
         <w:tc>
           <w:tcPr>
-            <w:tcW w:type="dxa" w:w="5000"/>
+            <w:tcW w:type="dxa" w:w="5200"/>
             <w:tcBorders>
               <w:top w:val="single" w:color="B8C2D0" w:sz="4"/>
               <w:left w:val="single" w:color="B8C2D0" w:sz="4"/>
@@ -1946,7 +2147,7 @@
         </w:tc>
         <w:tc>
           <w:tcPr>
-            <w:tcW w:type="dxa" w:w="4026"/>
+            <w:tcW w:type="dxa" w:w="3826"/>
             <w:tcBorders>
               <w:top w:val="single" w:color="B8C2D0" w:sz="4"/>
               <w:left w:val="single" w:color="B8C2D0" w:sz="4"/>
@@ -1970,7 +2171,7 @@
                 <w:sz w:val="19"/>
                 <w:szCs w:val="19"/>
               </w:rPr>
-              <w:t xml:space="preserve">Reason it is included</w:t>
+              <w:t xml:space="preserve">Reason</w:t>
             </w:r>
           </w:p>
         </w:tc>
@@ -1981,55 +2182,55 @@
         </w:trPr>
         <w:tc>
           <w:tcPr>
-            <w:tcW w:type="dxa" w:w="5000"/>
-            <w:tcBorders>
-              <w:top w:val="single" w:color="B8C2D0" w:sz="4"/>
-              <w:left w:val="single" w:color="B8C2D0" w:sz="4"/>
-              <w:bottom w:val="single" w:color="B8C2D0" w:sz="4"/>
-              <w:right w:val="single" w:color="B8C2D0" w:sz="4"/>
-            </w:tcBorders>
-            <w:shd w:fill="FFFFFF" w:color="auto" w:val="clear"/>
-            <w:tcMar>
-              <w:top w:type="dxa" w:w="60"/>
-              <w:left w:type="dxa" w:w="100"/>
-              <w:bottom w:type="dxa" w:w="60"/>
-              <w:right w:type="dxa" w:w="100"/>
-            </w:tcMar>
-          </w:tcPr>
-          <w:p>
-            <w:r>
-              <w:rPr>
-                <w:sz w:val="19"/>
-                <w:szCs w:val="19"/>
-              </w:rPr>
-              <w:t xml:space="preserve">Registration, login and logout with tokens (JWT), password reset, e-mail verification, session control</w:t>
-            </w:r>
-          </w:p>
-        </w:tc>
-        <w:tc>
-          <w:tcPr>
-            <w:tcW w:type="dxa" w:w="4026"/>
-            <w:tcBorders>
-              <w:top w:val="single" w:color="B8C2D0" w:sz="4"/>
-              <w:left w:val="single" w:color="B8C2D0" w:sz="4"/>
-              <w:bottom w:val="single" w:color="B8C2D0" w:sz="4"/>
-              <w:right w:val="single" w:color="B8C2D0" w:sz="4"/>
-            </w:tcBorders>
-            <w:shd w:fill="FFFFFF" w:color="auto" w:val="clear"/>
-            <w:tcMar>
-              <w:top w:type="dxa" w:w="60"/>
-              <w:left w:type="dxa" w:w="100"/>
-              <w:bottom w:type="dxa" w:w="60"/>
-              <w:right w:type="dxa" w:w="100"/>
-            </w:tcMar>
-          </w:tcPr>
-          <w:p>
-            <w:r>
-              <w:rPr>
-                <w:sz w:val="19"/>
-                <w:szCs w:val="19"/>
-              </w:rPr>
-              <w:t xml:space="preserve">All other features need to know who the user is</w:t>
+            <w:tcW w:type="dxa" w:w="5200"/>
+            <w:tcBorders>
+              <w:top w:val="single" w:color="B8C2D0" w:sz="4"/>
+              <w:left w:val="single" w:color="B8C2D0" w:sz="4"/>
+              <w:bottom w:val="single" w:color="B8C2D0" w:sz="4"/>
+              <w:right w:val="single" w:color="B8C2D0" w:sz="4"/>
+            </w:tcBorders>
+            <w:shd w:fill="FFFFFF" w:color="auto" w:val="clear"/>
+            <w:tcMar>
+              <w:top w:type="dxa" w:w="60"/>
+              <w:left w:type="dxa" w:w="100"/>
+              <w:bottom w:type="dxa" w:w="60"/>
+              <w:right w:type="dxa" w:w="100"/>
+            </w:tcMar>
+          </w:tcPr>
+          <w:p>
+            <w:r>
+              <w:rPr>
+                <w:sz w:val="19"/>
+                <w:szCs w:val="19"/>
+              </w:rPr>
+              <w:t xml:space="preserve">Live network monitoring, intrusion detection and SIEM log collection</w:t>
+            </w:r>
+          </w:p>
+        </w:tc>
+        <w:tc>
+          <w:tcPr>
+            <w:tcW w:type="dxa" w:w="3826"/>
+            <w:tcBorders>
+              <w:top w:val="single" w:color="B8C2D0" w:sz="4"/>
+              <w:left w:val="single" w:color="B8C2D0" w:sz="4"/>
+              <w:bottom w:val="single" w:color="B8C2D0" w:sz="4"/>
+              <w:right w:val="single" w:color="B8C2D0" w:sz="4"/>
+            </w:tcBorders>
+            <w:shd w:fill="FFFFFF" w:color="auto" w:val="clear"/>
+            <w:tcMar>
+              <w:top w:type="dxa" w:w="60"/>
+              <w:left w:type="dxa" w:w="100"/>
+              <w:bottom w:type="dxa" w:w="60"/>
+              <w:right w:type="dxa" w:w="100"/>
+            </w:tcMar>
+          </w:tcPr>
+          <w:p>
+            <w:r>
+              <w:rPr>
+                <w:sz w:val="19"/>
+                <w:szCs w:val="19"/>
+              </w:rPr>
+              <w:t xml:space="preserve">The system deals with people and process, not network sensors</w:t>
             </w:r>
           </w:p>
         </w:tc>
@@ -2040,55 +2241,55 @@
         </w:trPr>
         <w:tc>
           <w:tcPr>
-            <w:tcW w:type="dxa" w:w="5000"/>
-            <w:tcBorders>
-              <w:top w:val="single" w:color="B8C2D0" w:sz="4"/>
-              <w:left w:val="single" w:color="B8C2D0" w:sz="4"/>
-              <w:bottom w:val="single" w:color="B8C2D0" w:sz="4"/>
-              <w:right w:val="single" w:color="B8C2D0" w:sz="4"/>
-            </w:tcBorders>
-            <w:shd w:fill="FFFFFF" w:color="auto" w:val="clear"/>
-            <w:tcMar>
-              <w:top w:type="dxa" w:w="60"/>
-              <w:left w:type="dxa" w:w="100"/>
-              <w:bottom w:type="dxa" w:w="60"/>
-              <w:right w:type="dxa" w:w="100"/>
-            </w:tcMar>
-          </w:tcPr>
-          <w:p>
-            <w:r>
-              <w:rPr>
-                <w:sz w:val="19"/>
-                <w:szCs w:val="19"/>
-              </w:rPr>
-              <w:t xml:space="preserve">Three roles: normal user, cybersecurity officer, system administrator</w:t>
-            </w:r>
-          </w:p>
-        </w:tc>
-        <w:tc>
-          <w:tcPr>
-            <w:tcW w:type="dxa" w:w="4026"/>
-            <w:tcBorders>
-              <w:top w:val="single" w:color="B8C2D0" w:sz="4"/>
-              <w:left w:val="single" w:color="B8C2D0" w:sz="4"/>
-              <w:bottom w:val="single" w:color="B8C2D0" w:sz="4"/>
-              <w:right w:val="single" w:color="B8C2D0" w:sz="4"/>
-            </w:tcBorders>
-            <w:shd w:fill="FFFFFF" w:color="auto" w:val="clear"/>
-            <w:tcMar>
-              <w:top w:type="dxa" w:w="60"/>
-              <w:left w:type="dxa" w:w="100"/>
-              <w:bottom w:type="dxa" w:w="60"/>
-              <w:right w:type="dxa" w:w="100"/>
-            </w:tcMar>
-          </w:tcPr>
-          <w:p>
-            <w:r>
-              <w:rPr>
-                <w:sz w:val="19"/>
-                <w:szCs w:val="19"/>
-              </w:rPr>
-              <w:t xml:space="preserve">People need different powers; each person should have only the power they need</w:t>
+            <w:tcW w:type="dxa" w:w="5200"/>
+            <w:tcBorders>
+              <w:top w:val="single" w:color="B8C2D0" w:sz="4"/>
+              <w:left w:val="single" w:color="B8C2D0" w:sz="4"/>
+              <w:bottom w:val="single" w:color="B8C2D0" w:sz="4"/>
+              <w:right w:val="single" w:color="B8C2D0" w:sz="4"/>
+            </w:tcBorders>
+            <w:shd w:fill="FFFFFF" w:color="auto" w:val="clear"/>
+            <w:tcMar>
+              <w:top w:type="dxa" w:w="60"/>
+              <w:left w:type="dxa" w:w="100"/>
+              <w:bottom w:type="dxa" w:w="60"/>
+              <w:right w:type="dxa" w:w="100"/>
+            </w:tcMar>
+          </w:tcPr>
+          <w:p>
+            <w:r>
+              <w:rPr>
+                <w:sz w:val="19"/>
+                <w:szCs w:val="19"/>
+              </w:rPr>
+              <w:t xml:space="preserve">Sending real phishing e-mails to staff</w:t>
+            </w:r>
+          </w:p>
+        </w:tc>
+        <w:tc>
+          <w:tcPr>
+            <w:tcW w:type="dxa" w:w="3826"/>
+            <w:tcBorders>
+              <w:top w:val="single" w:color="B8C2D0" w:sz="4"/>
+              <w:left w:val="single" w:color="B8C2D0" w:sz="4"/>
+              <w:bottom w:val="single" w:color="B8C2D0" w:sz="4"/>
+              <w:right w:val="single" w:color="B8C2D0" w:sz="4"/>
+            </w:tcBorders>
+            <w:shd w:fill="FFFFFF" w:color="auto" w:val="clear"/>
+            <w:tcMar>
+              <w:top w:type="dxa" w:w="60"/>
+              <w:left w:type="dxa" w:w="100"/>
+              <w:bottom w:type="dxa" w:w="60"/>
+              <w:right w:type="dxa" w:w="100"/>
+            </w:tcMar>
+          </w:tcPr>
+          <w:p>
+            <w:r>
+              <w:rPr>
+                <w:sz w:val="19"/>
+                <w:szCs w:val="19"/>
+              </w:rPr>
+              <w:t xml:space="preserve">The simulator is an inbox inside the system</w:t>
             </w:r>
           </w:p>
         </w:tc>
@@ -2099,55 +2300,55 @@
         </w:trPr>
         <w:tc>
           <w:tcPr>
-            <w:tcW w:type="dxa" w:w="5000"/>
-            <w:tcBorders>
-              <w:top w:val="single" w:color="B8C2D0" w:sz="4"/>
-              <w:left w:val="single" w:color="B8C2D0" w:sz="4"/>
-              <w:bottom w:val="single" w:color="B8C2D0" w:sz="4"/>
-              <w:right w:val="single" w:color="B8C2D0" w:sz="4"/>
-            </w:tcBorders>
-            <w:shd w:fill="FFFFFF" w:color="auto" w:val="clear"/>
-            <w:tcMar>
-              <w:top w:type="dxa" w:w="60"/>
-              <w:left w:type="dxa" w:w="100"/>
-              <w:bottom w:type="dxa" w:w="60"/>
-              <w:right w:type="dxa" w:w="100"/>
-            </w:tcMar>
-          </w:tcPr>
-          <w:p>
-            <w:r>
-              <w:rPr>
-                <w:sz w:val="19"/>
-                <w:szCs w:val="19"/>
-              </w:rPr>
-              <w:t xml:space="preserve">Training library with categories, lessons, difficulty levels, tags, progress, bookmarks and recommendations</w:t>
-            </w:r>
-          </w:p>
-        </w:tc>
-        <w:tc>
-          <w:tcPr>
-            <w:tcW w:type="dxa" w:w="4026"/>
-            <w:tcBorders>
-              <w:top w:val="single" w:color="B8C2D0" w:sz="4"/>
-              <w:left w:val="single" w:color="B8C2D0" w:sz="4"/>
-              <w:bottom w:val="single" w:color="B8C2D0" w:sz="4"/>
-              <w:right w:val="single" w:color="B8C2D0" w:sz="4"/>
-            </w:tcBorders>
-            <w:shd w:fill="FFFFFF" w:color="auto" w:val="clear"/>
-            <w:tcMar>
-              <w:top w:type="dxa" w:w="60"/>
-              <w:left w:type="dxa" w:w="100"/>
-              <w:bottom w:type="dxa" w:w="60"/>
-              <w:right w:type="dxa" w:w="100"/>
-            </w:tcMar>
-          </w:tcPr>
-          <w:p>
-            <w:r>
-              <w:rPr>
-                <w:sz w:val="19"/>
-                <w:szCs w:val="19"/>
-              </w:rPr>
-              <w:t xml:space="preserve">This is the main learning content</w:t>
+            <w:tcW w:type="dxa" w:w="5200"/>
+            <w:tcBorders>
+              <w:top w:val="single" w:color="B8C2D0" w:sz="4"/>
+              <w:left w:val="single" w:color="B8C2D0" w:sz="4"/>
+              <w:bottom w:val="single" w:color="B8C2D0" w:sz="4"/>
+              <w:right w:val="single" w:color="B8C2D0" w:sz="4"/>
+            </w:tcBorders>
+            <w:shd w:fill="FFFFFF" w:color="auto" w:val="clear"/>
+            <w:tcMar>
+              <w:top w:type="dxa" w:w="60"/>
+              <w:left w:type="dxa" w:w="100"/>
+              <w:bottom w:type="dxa" w:w="60"/>
+              <w:right w:type="dxa" w:w="100"/>
+            </w:tcMar>
+          </w:tcPr>
+          <w:p>
+            <w:r>
+              <w:rPr>
+                <w:sz w:val="19"/>
+                <w:szCs w:val="19"/>
+              </w:rPr>
+              <w:t xml:space="preserve">Malware analysis of uploaded files</w:t>
+            </w:r>
+          </w:p>
+        </w:tc>
+        <w:tc>
+          <w:tcPr>
+            <w:tcW w:type="dxa" w:w="3826"/>
+            <w:tcBorders>
+              <w:top w:val="single" w:color="B8C2D0" w:sz="4"/>
+              <w:left w:val="single" w:color="B8C2D0" w:sz="4"/>
+              <w:bottom w:val="single" w:color="B8C2D0" w:sz="4"/>
+              <w:right w:val="single" w:color="B8C2D0" w:sz="4"/>
+            </w:tcBorders>
+            <w:shd w:fill="FFFFFF" w:color="auto" w:val="clear"/>
+            <w:tcMar>
+              <w:top w:type="dxa" w:w="60"/>
+              <w:left w:type="dxa" w:w="100"/>
+              <w:bottom w:type="dxa" w:w="60"/>
+              <w:right w:type="dxa" w:w="100"/>
+            </w:tcMar>
+          </w:tcPr>
+          <w:p>
+            <w:r>
+              <w:rPr>
+                <w:sz w:val="19"/>
+                <w:szCs w:val="19"/>
+              </w:rPr>
+              <w:t xml:space="preserve">Files are stored and never run</w:t>
             </w:r>
           </w:p>
         </w:tc>
@@ -2158,527 +2359,55 @@
         </w:trPr>
         <w:tc>
           <w:tcPr>
-            <w:tcW w:type="dxa" w:w="5000"/>
-            <w:tcBorders>
-              <w:top w:val="single" w:color="B8C2D0" w:sz="4"/>
-              <w:left w:val="single" w:color="B8C2D0" w:sz="4"/>
-              <w:bottom w:val="single" w:color="B8C2D0" w:sz="4"/>
-              <w:right w:val="single" w:color="B8C2D0" w:sz="4"/>
-            </w:tcBorders>
-            <w:shd w:fill="FFFFFF" w:color="auto" w:val="clear"/>
-            <w:tcMar>
-              <w:top w:type="dxa" w:w="60"/>
-              <w:left w:type="dxa" w:w="100"/>
-              <w:bottom w:type="dxa" w:w="60"/>
-              <w:right w:type="dxa" w:w="100"/>
-            </w:tcMar>
-          </w:tcPr>
-          <w:p>
-            <w:r>
-              <w:rPr>
-                <w:sz w:val="19"/>
-                <w:szCs w:val="19"/>
-              </w:rPr>
-              <w:t xml:space="preserve">Quiz engine: timed multiple-choice quizzes, scoring, pass mark, attempt limits, weak-topic analysis</w:t>
-            </w:r>
-          </w:p>
-        </w:tc>
-        <w:tc>
-          <w:tcPr>
-            <w:tcW w:type="dxa" w:w="4026"/>
-            <w:tcBorders>
-              <w:top w:val="single" w:color="B8C2D0" w:sz="4"/>
-              <w:left w:val="single" w:color="B8C2D0" w:sz="4"/>
-              <w:bottom w:val="single" w:color="B8C2D0" w:sz="4"/>
-              <w:right w:val="single" w:color="B8C2D0" w:sz="4"/>
-            </w:tcBorders>
-            <w:shd w:fill="FFFFFF" w:color="auto" w:val="clear"/>
-            <w:tcMar>
-              <w:top w:type="dxa" w:w="60"/>
-              <w:left w:type="dxa" w:w="100"/>
-              <w:bottom w:type="dxa" w:w="60"/>
-              <w:right w:type="dxa" w:w="100"/>
-            </w:tcMar>
-          </w:tcPr>
-          <w:p>
-            <w:r>
-              <w:rPr>
-                <w:sz w:val="19"/>
-                <w:szCs w:val="19"/>
-              </w:rPr>
-              <w:t xml:space="preserve">It measures if learning happened</w:t>
-            </w:r>
-          </w:p>
-        </w:tc>
-      </w:tr>
-      <w:tr>
-        <w:trPr>
-          <w:cantSplit/>
-        </w:trPr>
-        <w:tc>
-          <w:tcPr>
-            <w:tcW w:type="dxa" w:w="5000"/>
-            <w:tcBorders>
-              <w:top w:val="single" w:color="B8C2D0" w:sz="4"/>
-              <w:left w:val="single" w:color="B8C2D0" w:sz="4"/>
-              <w:bottom w:val="single" w:color="B8C2D0" w:sz="4"/>
-              <w:right w:val="single" w:color="B8C2D0" w:sz="4"/>
-            </w:tcBorders>
-            <w:shd w:fill="FFFFFF" w:color="auto" w:val="clear"/>
-            <w:tcMar>
-              <w:top w:type="dxa" w:w="60"/>
-              <w:left w:type="dxa" w:w="100"/>
-              <w:bottom w:type="dxa" w:w="60"/>
-              <w:right w:type="dxa" w:w="100"/>
-            </w:tcMar>
-          </w:tcPr>
-          <w:p>
-            <w:r>
-              <w:rPr>
-                <w:sz w:val="19"/>
-                <w:szCs w:val="19"/>
-              </w:rPr>
-              <w:t xml:space="preserve">Phishing simulator: inbox scenarios, link inspection, red-flag choice, scored feedback</w:t>
-            </w:r>
-          </w:p>
-        </w:tc>
-        <w:tc>
-          <w:tcPr>
-            <w:tcW w:type="dxa" w:w="4026"/>
-            <w:tcBorders>
-              <w:top w:val="single" w:color="B8C2D0" w:sz="4"/>
-              <w:left w:val="single" w:color="B8C2D0" w:sz="4"/>
-              <w:bottom w:val="single" w:color="B8C2D0" w:sz="4"/>
-              <w:right w:val="single" w:color="B8C2D0" w:sz="4"/>
-            </w:tcBorders>
-            <w:shd w:fill="FFFFFF" w:color="auto" w:val="clear"/>
-            <w:tcMar>
-              <w:top w:type="dxa" w:w="60"/>
-              <w:left w:type="dxa" w:w="100"/>
-              <w:bottom w:type="dxa" w:w="60"/>
-              <w:right w:type="dxa" w:w="100"/>
-            </w:tcMar>
-          </w:tcPr>
-          <w:p>
-            <w:r>
-              <w:rPr>
-                <w:sz w:val="19"/>
-                <w:szCs w:val="19"/>
-              </w:rPr>
-              <w:t xml:space="preserve">It builds real skill in a safe way</w:t>
-            </w:r>
-          </w:p>
-        </w:tc>
-      </w:tr>
-      <w:tr>
-        <w:trPr>
-          <w:cantSplit/>
-        </w:trPr>
-        <w:tc>
-          <w:tcPr>
-            <w:tcW w:type="dxa" w:w="5000"/>
-            <w:tcBorders>
-              <w:top w:val="single" w:color="B8C2D0" w:sz="4"/>
-              <w:left w:val="single" w:color="B8C2D0" w:sz="4"/>
-              <w:bottom w:val="single" w:color="B8C2D0" w:sz="4"/>
-              <w:right w:val="single" w:color="B8C2D0" w:sz="4"/>
-            </w:tcBorders>
-            <w:shd w:fill="FFFFFF" w:color="auto" w:val="clear"/>
-            <w:tcMar>
-              <w:top w:type="dxa" w:w="60"/>
-              <w:left w:type="dxa" w:w="100"/>
-              <w:bottom w:type="dxa" w:w="60"/>
-              <w:right w:type="dxa" w:w="100"/>
-            </w:tcMar>
-          </w:tcPr>
-          <w:p>
-            <w:r>
-              <w:rPr>
-                <w:sz w:val="19"/>
-                <w:szCs w:val="19"/>
-              </w:rPr>
-              <w:t xml:space="preserve">Incident reporting with evidence upload, drafts and reference numbers</w:t>
-            </w:r>
-          </w:p>
-        </w:tc>
-        <w:tc>
-          <w:tcPr>
-            <w:tcW w:type="dxa" w:w="4026"/>
-            <w:tcBorders>
-              <w:top w:val="single" w:color="B8C2D0" w:sz="4"/>
-              <w:left w:val="single" w:color="B8C2D0" w:sz="4"/>
-              <w:bottom w:val="single" w:color="B8C2D0" w:sz="4"/>
-              <w:right w:val="single" w:color="B8C2D0" w:sz="4"/>
-            </w:tcBorders>
-            <w:shd w:fill="FFFFFF" w:color="auto" w:val="clear"/>
-            <w:tcMar>
-              <w:top w:type="dxa" w:w="60"/>
-              <w:left w:type="dxa" w:w="100"/>
-              <w:bottom w:type="dxa" w:w="60"/>
-              <w:right w:type="dxa" w:w="100"/>
-            </w:tcMar>
-          </w:tcPr>
-          <w:p>
-            <w:r>
-              <w:rPr>
-                <w:sz w:val="19"/>
-                <w:szCs w:val="19"/>
-              </w:rPr>
-              <w:t xml:space="preserve">It fixes informal reporting</w:t>
-            </w:r>
-          </w:p>
-        </w:tc>
-      </w:tr>
-      <w:tr>
-        <w:trPr>
-          <w:cantSplit/>
-        </w:trPr>
-        <w:tc>
-          <w:tcPr>
-            <w:tcW w:type="dxa" w:w="5000"/>
-            <w:tcBorders>
-              <w:top w:val="single" w:color="B8C2D0" w:sz="4"/>
-              <w:left w:val="single" w:color="B8C2D0" w:sz="4"/>
-              <w:bottom w:val="single" w:color="B8C2D0" w:sz="4"/>
-              <w:right w:val="single" w:color="B8C2D0" w:sz="4"/>
-            </w:tcBorders>
-            <w:shd w:fill="FFFFFF" w:color="auto" w:val="clear"/>
-            <w:tcMar>
-              <w:top w:type="dxa" w:w="60"/>
-              <w:left w:type="dxa" w:w="100"/>
-              <w:bottom w:type="dxa" w:w="60"/>
-              <w:right w:type="dxa" w:w="100"/>
-            </w:tcMar>
-          </w:tcPr>
-          <w:p>
-            <w:r>
-              <w:rPr>
-                <w:sz w:val="19"/>
-                <w:szCs w:val="19"/>
-              </w:rPr>
-              <w:t xml:space="preserve">SOC queue: Kanban board, assignment, escalation, status flow and timeline</w:t>
-            </w:r>
-          </w:p>
-        </w:tc>
-        <w:tc>
-          <w:tcPr>
-            <w:tcW w:type="dxa" w:w="4026"/>
-            <w:tcBorders>
-              <w:top w:val="single" w:color="B8C2D0" w:sz="4"/>
-              <w:left w:val="single" w:color="B8C2D0" w:sz="4"/>
-              <w:bottom w:val="single" w:color="B8C2D0" w:sz="4"/>
-              <w:right w:val="single" w:color="B8C2D0" w:sz="4"/>
-            </w:tcBorders>
-            <w:shd w:fill="FFFFFF" w:color="auto" w:val="clear"/>
-            <w:tcMar>
-              <w:top w:type="dxa" w:w="60"/>
-              <w:left w:type="dxa" w:w="100"/>
-              <w:bottom w:type="dxa" w:w="60"/>
-              <w:right w:type="dxa" w:w="100"/>
-            </w:tcMar>
-          </w:tcPr>
-          <w:p>
-            <w:r>
-              <w:rPr>
-                <w:sz w:val="19"/>
-                <w:szCs w:val="19"/>
-              </w:rPr>
-              <w:t xml:space="preserve">It fixes tracking and accountability</w:t>
-            </w:r>
-          </w:p>
-        </w:tc>
-      </w:tr>
-      <w:tr>
-        <w:trPr>
-          <w:cantSplit/>
-        </w:trPr>
-        <w:tc>
-          <w:tcPr>
-            <w:tcW w:type="dxa" w:w="5000"/>
-            <w:tcBorders>
-              <w:top w:val="single" w:color="B8C2D0" w:sz="4"/>
-              <w:left w:val="single" w:color="B8C2D0" w:sz="4"/>
-              <w:bottom w:val="single" w:color="B8C2D0" w:sz="4"/>
-              <w:right w:val="single" w:color="B8C2D0" w:sz="4"/>
-            </w:tcBorders>
-            <w:shd w:fill="FFFFFF" w:color="auto" w:val="clear"/>
-            <w:tcMar>
-              <w:top w:type="dxa" w:w="60"/>
-              <w:left w:type="dxa" w:w="100"/>
-              <w:bottom w:type="dxa" w:w="60"/>
-              <w:right w:type="dxa" w:w="100"/>
-            </w:tcMar>
-          </w:tcPr>
-          <w:p>
-            <w:r>
-              <w:rPr>
-                <w:sz w:val="19"/>
-                <w:szCs w:val="19"/>
-              </w:rPr>
-              <w:t xml:space="preserve">Alerts and a notification centre</w:t>
-            </w:r>
-          </w:p>
-        </w:tc>
-        <w:tc>
-          <w:tcPr>
-            <w:tcW w:type="dxa" w:w="4026"/>
-            <w:tcBorders>
-              <w:top w:val="single" w:color="B8C2D0" w:sz="4"/>
-              <w:left w:val="single" w:color="B8C2D0" w:sz="4"/>
-              <w:bottom w:val="single" w:color="B8C2D0" w:sz="4"/>
-              <w:right w:val="single" w:color="B8C2D0" w:sz="4"/>
-            </w:tcBorders>
-            <w:shd w:fill="FFFFFF" w:color="auto" w:val="clear"/>
-            <w:tcMar>
-              <w:top w:type="dxa" w:w="60"/>
-              <w:left w:type="dxa" w:w="100"/>
-              <w:bottom w:type="dxa" w:w="60"/>
-              <w:right w:type="dxa" w:w="100"/>
-            </w:tcMar>
-          </w:tcPr>
-          <w:p>
-            <w:r>
-              <w:rPr>
-                <w:sz w:val="19"/>
-                <w:szCs w:val="19"/>
-              </w:rPr>
-              <w:t xml:space="preserve">It sends urgent warnings to the right people</w:t>
-            </w:r>
-          </w:p>
-        </w:tc>
-      </w:tr>
-      <w:tr>
-        <w:trPr>
-          <w:cantSplit/>
-        </w:trPr>
-        <w:tc>
-          <w:tcPr>
-            <w:tcW w:type="dxa" w:w="5000"/>
-            <w:tcBorders>
-              <w:top w:val="single" w:color="B8C2D0" w:sz="4"/>
-              <w:left w:val="single" w:color="B8C2D0" w:sz="4"/>
-              <w:bottom w:val="single" w:color="B8C2D0" w:sz="4"/>
-              <w:right w:val="single" w:color="B8C2D0" w:sz="4"/>
-            </w:tcBorders>
-            <w:shd w:fill="FFFFFF" w:color="auto" w:val="clear"/>
-            <w:tcMar>
-              <w:top w:type="dxa" w:w="60"/>
-              <w:left w:type="dxa" w:w="100"/>
-              <w:bottom w:type="dxa" w:w="60"/>
-              <w:right w:type="dxa" w:w="100"/>
-            </w:tcMar>
-          </w:tcPr>
-          <w:p>
-            <w:r>
-              <w:rPr>
-                <w:sz w:val="19"/>
-                <w:szCs w:val="19"/>
-              </w:rPr>
-              <w:t xml:space="preserve">Analytics dashboards for one user and for the whole organisation</w:t>
-            </w:r>
-          </w:p>
-        </w:tc>
-        <w:tc>
-          <w:tcPr>
-            <w:tcW w:type="dxa" w:w="4026"/>
-            <w:tcBorders>
-              <w:top w:val="single" w:color="B8C2D0" w:sz="4"/>
-              <w:left w:val="single" w:color="B8C2D0" w:sz="4"/>
-              <w:bottom w:val="single" w:color="B8C2D0" w:sz="4"/>
-              <w:right w:val="single" w:color="B8C2D0" w:sz="4"/>
-            </w:tcBorders>
-            <w:shd w:fill="FFFFFF" w:color="auto" w:val="clear"/>
-            <w:tcMar>
-              <w:top w:type="dxa" w:w="60"/>
-              <w:left w:type="dxa" w:w="100"/>
-              <w:bottom w:type="dxa" w:w="60"/>
-              <w:right w:type="dxa" w:w="100"/>
-            </w:tcMar>
-          </w:tcPr>
-          <w:p>
-            <w:r>
-              <w:rPr>
-                <w:sz w:val="19"/>
-                <w:szCs w:val="19"/>
-              </w:rPr>
-              <w:t xml:space="preserve">It gives management clear numbers</w:t>
-            </w:r>
-          </w:p>
-        </w:tc>
-      </w:tr>
-      <w:tr>
-        <w:trPr>
-          <w:cantSplit/>
-        </w:trPr>
-        <w:tc>
-          <w:tcPr>
-            <w:tcW w:type="dxa" w:w="5000"/>
-            <w:tcBorders>
-              <w:top w:val="single" w:color="B8C2D0" w:sz="4"/>
-              <w:left w:val="single" w:color="B8C2D0" w:sz="4"/>
-              <w:bottom w:val="single" w:color="B8C2D0" w:sz="4"/>
-              <w:right w:val="single" w:color="B8C2D0" w:sz="4"/>
-            </w:tcBorders>
-            <w:shd w:fill="FFFFFF" w:color="auto" w:val="clear"/>
-            <w:tcMar>
-              <w:top w:type="dxa" w:w="60"/>
-              <w:left w:type="dxa" w:w="100"/>
-              <w:bottom w:type="dxa" w:w="60"/>
-              <w:right w:type="dxa" w:w="100"/>
-            </w:tcMar>
-          </w:tcPr>
-          <w:p>
-            <w:r>
-              <w:rPr>
-                <w:sz w:val="19"/>
-                <w:szCs w:val="19"/>
-              </w:rPr>
-              <w:t xml:space="preserve">Audit log with filters and CSV export</w:t>
-            </w:r>
-          </w:p>
-        </w:tc>
-        <w:tc>
-          <w:tcPr>
-            <w:tcW w:type="dxa" w:w="4026"/>
-            <w:tcBorders>
-              <w:top w:val="single" w:color="B8C2D0" w:sz="4"/>
-              <w:left w:val="single" w:color="B8C2D0" w:sz="4"/>
-              <w:bottom w:val="single" w:color="B8C2D0" w:sz="4"/>
-              <w:right w:val="single" w:color="B8C2D0" w:sz="4"/>
-            </w:tcBorders>
-            <w:shd w:fill="FFFFFF" w:color="auto" w:val="clear"/>
-            <w:tcMar>
-              <w:top w:type="dxa" w:w="60"/>
-              <w:left w:type="dxa" w:w="100"/>
-              <w:bottom w:type="dxa" w:w="60"/>
-              <w:right w:type="dxa" w:w="100"/>
-            </w:tcMar>
-          </w:tcPr>
-          <w:p>
-            <w:r>
-              <w:rPr>
-                <w:sz w:val="19"/>
-                <w:szCs w:val="19"/>
-              </w:rPr>
-              <w:t xml:space="preserve">It gives accountability</w:t>
-            </w:r>
-          </w:p>
-        </w:tc>
-      </w:tr>
-      <w:tr>
-        <w:trPr>
-          <w:cantSplit/>
-        </w:trPr>
-        <w:tc>
-          <w:tcPr>
-            <w:tcW w:type="dxa" w:w="5000"/>
-            <w:tcBorders>
-              <w:top w:val="single" w:color="B8C2D0" w:sz="4"/>
-              <w:left w:val="single" w:color="B8C2D0" w:sz="4"/>
-              <w:bottom w:val="single" w:color="B8C2D0" w:sz="4"/>
-              <w:right w:val="single" w:color="B8C2D0" w:sz="4"/>
-            </w:tcBorders>
-            <w:shd w:fill="FFFFFF" w:color="auto" w:val="clear"/>
-            <w:tcMar>
-              <w:top w:type="dxa" w:w="60"/>
-              <w:left w:type="dxa" w:w="100"/>
-              <w:bottom w:type="dxa" w:w="60"/>
-              <w:right w:type="dxa" w:w="100"/>
-            </w:tcMar>
-          </w:tcPr>
-          <w:p>
-            <w:r>
-              <w:rPr>
-                <w:sz w:val="19"/>
-                <w:szCs w:val="19"/>
-              </w:rPr>
-              <w:t xml:space="preserve">Admin tools for lessons, quizzes, simulations, categories, quiz settings and users</w:t>
-            </w:r>
-          </w:p>
-        </w:tc>
-        <w:tc>
-          <w:tcPr>
-            <w:tcW w:type="dxa" w:w="4026"/>
-            <w:tcBorders>
-              <w:top w:val="single" w:color="B8C2D0" w:sz="4"/>
-              <w:left w:val="single" w:color="B8C2D0" w:sz="4"/>
-              <w:bottom w:val="single" w:color="B8C2D0" w:sz="4"/>
-              <w:right w:val="single" w:color="B8C2D0" w:sz="4"/>
-            </w:tcBorders>
-            <w:shd w:fill="FFFFFF" w:color="auto" w:val="clear"/>
-            <w:tcMar>
-              <w:top w:type="dxa" w:w="60"/>
-              <w:left w:type="dxa" w:w="100"/>
-              <w:bottom w:type="dxa" w:w="60"/>
-              <w:right w:type="dxa" w:w="100"/>
-            </w:tcMar>
-          </w:tcPr>
-          <w:p>
-            <w:r>
-              <w:rPr>
-                <w:sz w:val="19"/>
-                <w:szCs w:val="19"/>
-              </w:rPr>
-              <w:t xml:space="preserve">The organisation can update content without a programmer</w:t>
-            </w:r>
-          </w:p>
-        </w:tc>
-      </w:tr>
-      <w:tr>
-        <w:trPr>
-          <w:cantSplit/>
-        </w:trPr>
-        <w:tc>
-          <w:tcPr>
-            <w:tcW w:type="dxa" w:w="5000"/>
-            <w:tcBorders>
-              <w:top w:val="single" w:color="B8C2D0" w:sz="4"/>
-              <w:left w:val="single" w:color="B8C2D0" w:sz="4"/>
-              <w:bottom w:val="single" w:color="B8C2D0" w:sz="4"/>
-              <w:right w:val="single" w:color="B8C2D0" w:sz="4"/>
-            </w:tcBorders>
-            <w:shd w:fill="FFFFFF" w:color="auto" w:val="clear"/>
-            <w:tcMar>
-              <w:top w:type="dxa" w:w="60"/>
-              <w:left w:type="dxa" w:w="100"/>
-              <w:bottom w:type="dxa" w:w="60"/>
-              <w:right w:type="dxa" w:w="100"/>
-            </w:tcMar>
-          </w:tcPr>
-          <w:p>
-            <w:r>
-              <w:rPr>
-                <w:sz w:val="19"/>
-                <w:szCs w:val="19"/>
-              </w:rPr>
-              <w:t xml:space="preserve">Web app (React) and mobile app (Flutter) for learners and incident reporters</w:t>
-            </w:r>
-          </w:p>
-        </w:tc>
-        <w:tc>
-          <w:tcPr>
-            <w:tcW w:type="dxa" w:w="4026"/>
-            <w:tcBorders>
-              <w:top w:val="single" w:color="B8C2D0" w:sz="4"/>
-              <w:left w:val="single" w:color="B8C2D0" w:sz="4"/>
-              <w:bottom w:val="single" w:color="B8C2D0" w:sz="4"/>
-              <w:right w:val="single" w:color="B8C2D0" w:sz="4"/>
-            </w:tcBorders>
-            <w:shd w:fill="FFFFFF" w:color="auto" w:val="clear"/>
-            <w:tcMar>
-              <w:top w:type="dxa" w:w="60"/>
-              <w:left w:type="dxa" w:w="100"/>
-              <w:bottom w:type="dxa" w:w="60"/>
-              <w:right w:type="dxa" w:w="100"/>
-            </w:tcMar>
-          </w:tcPr>
-          <w:p>
-            <w:r>
-              <w:rPr>
-                <w:sz w:val="19"/>
-                <w:szCs w:val="19"/>
-              </w:rPr>
-              <w:t xml:space="preserve">Staff use both computers and phones</w:t>
+            <w:tcW w:type="dxa" w:w="5200"/>
+            <w:tcBorders>
+              <w:top w:val="single" w:color="B8C2D0" w:sz="4"/>
+              <w:left w:val="single" w:color="B8C2D0" w:sz="4"/>
+              <w:bottom w:val="single" w:color="B8C2D0" w:sz="4"/>
+              <w:right w:val="single" w:color="B8C2D0" w:sz="4"/>
+            </w:tcBorders>
+            <w:shd w:fill="FFFFFF" w:color="auto" w:val="clear"/>
+            <w:tcMar>
+              <w:top w:type="dxa" w:w="60"/>
+              <w:left w:type="dxa" w:w="100"/>
+              <w:bottom w:type="dxa" w:w="60"/>
+              <w:right w:type="dxa" w:w="100"/>
+            </w:tcMar>
+          </w:tcPr>
+          <w:p>
+            <w:r>
+              <w:rPr>
+                <w:sz w:val="19"/>
+                <w:szCs w:val="19"/>
+              </w:rPr>
+              <w:t xml:space="preserve">Single sign-on with HR or directory systems</w:t>
+            </w:r>
+          </w:p>
+        </w:tc>
+        <w:tc>
+          <w:tcPr>
+            <w:tcW w:type="dxa" w:w="3826"/>
+            <w:tcBorders>
+              <w:top w:val="single" w:color="B8C2D0" w:sz="4"/>
+              <w:left w:val="single" w:color="B8C2D0" w:sz="4"/>
+              <w:bottom w:val="single" w:color="B8C2D0" w:sz="4"/>
+              <w:right w:val="single" w:color="B8C2D0" w:sz="4"/>
+            </w:tcBorders>
+            <w:shd w:fill="FFFFFF" w:color="auto" w:val="clear"/>
+            <w:tcMar>
+              <w:top w:type="dxa" w:w="60"/>
+              <w:left w:type="dxa" w:w="100"/>
+              <w:bottom w:type="dxa" w:w="60"/>
+              <w:right w:type="dxa" w:w="100"/>
+            </w:tcMar>
+          </w:tcPr>
+          <w:p>
+            <w:r>
+              <w:rPr>
+                <w:sz w:val="19"/>
+                <w:szCs w:val="19"/>
+              </w:rPr>
+              <w:t xml:space="preserve">Accounts are managed inside the system</w:t>
             </w:r>
           </w:p>
         </w:tc>
@@ -2691,10 +2420,18 @@
     </w:p>
     <w:p>
       <w:pPr>
-        <w:pStyle w:val="Heading2"/>
-      </w:pPr>
-      <w:r>
-        <w:t xml:space="preserve">1.3.2 What is out of scope</w:t>
+        <w:pStyle w:val="Heading1"/>
+      </w:pPr>
+      <w:r>
+        <w:t xml:space="preserve">1.4 Objectives (SMART)</w:t>
+      </w:r>
+    </w:p>
+    <w:p>
+      <w:pPr>
+        <w:spacing w:after="120" w:line="300"/>
+      </w:pPr>
+      <w:r>
+        <w:t xml:space="preserve">The system has five objectives. Each is Specific, Measurable, Achievable, Relevant and Time-bound. Chapter 5 proves each one with tests.</w:t>
       </w:r>
     </w:p>
     <w:p>
@@ -2710,480 +2447,7 @@
           <w:sz w:val="19"/>
           <w:szCs w:val="19"/>
         </w:rPr>
-        <w:t xml:space="preserve">Table 1.4: Items out of scope</w:t>
-      </w:r>
-    </w:p>
-    <w:tbl>
-      <w:tblPr>
-        <w:tblW w:type="dxa" w:w="9026"/>
-        <w:tblBorders>
-          <w:top w:val="single" w:color="auto" w:sz="4"/>
-          <w:left w:val="single" w:color="auto" w:sz="4"/>
-          <w:bottom w:val="single" w:color="auto" w:sz="4"/>
-          <w:right w:val="single" w:color="auto" w:sz="4"/>
-          <w:insideH w:val="single" w:color="auto" w:sz="4"/>
-          <w:insideV w:val="single" w:color="auto" w:sz="4"/>
-        </w:tblBorders>
-      </w:tblPr>
-      <w:tblGrid>
-        <w:gridCol w:w="5000"/>
-        <w:gridCol w:w="4026"/>
-      </w:tblGrid>
-      <w:tr>
-        <w:trPr>
-          <w:tblHeader/>
-        </w:trPr>
-        <w:tc>
-          <w:tcPr>
-            <w:tcW w:type="dxa" w:w="5000"/>
-            <w:tcBorders>
-              <w:top w:val="single" w:color="B8C2D0" w:sz="4"/>
-              <w:left w:val="single" w:color="B8C2D0" w:sz="4"/>
-              <w:bottom w:val="single" w:color="B8C2D0" w:sz="4"/>
-              <w:right w:val="single" w:color="B8C2D0" w:sz="4"/>
-            </w:tcBorders>
-            <w:shd w:fill="1F3A5F" w:color="auto" w:val="clear"/>
-            <w:tcMar>
-              <w:top w:type="dxa" w:w="60"/>
-              <w:left w:type="dxa" w:w="100"/>
-              <w:bottom w:type="dxa" w:w="60"/>
-              <w:right w:type="dxa" w:w="100"/>
-            </w:tcMar>
-          </w:tcPr>
-          <w:p>
-            <w:r>
-              <w:rPr>
-                <w:b/>
-                <w:bCs/>
-                <w:color w:val="FFFFFF"/>
-                <w:sz w:val="19"/>
-                <w:szCs w:val="19"/>
-              </w:rPr>
-              <w:t xml:space="preserve">Item</w:t>
-            </w:r>
-          </w:p>
-        </w:tc>
-        <w:tc>
-          <w:tcPr>
-            <w:tcW w:type="dxa" w:w="4026"/>
-            <w:tcBorders>
-              <w:top w:val="single" w:color="B8C2D0" w:sz="4"/>
-              <w:left w:val="single" w:color="B8C2D0" w:sz="4"/>
-              <w:bottom w:val="single" w:color="B8C2D0" w:sz="4"/>
-              <w:right w:val="single" w:color="B8C2D0" w:sz="4"/>
-            </w:tcBorders>
-            <w:shd w:fill="1F3A5F" w:color="auto" w:val="clear"/>
-            <w:tcMar>
-              <w:top w:type="dxa" w:w="60"/>
-              <w:left w:type="dxa" w:w="100"/>
-              <w:bottom w:type="dxa" w:w="60"/>
-              <w:right w:type="dxa" w:w="100"/>
-            </w:tcMar>
-          </w:tcPr>
-          <w:p>
-            <w:r>
-              <w:rPr>
-                <w:b/>
-                <w:bCs/>
-                <w:color w:val="FFFFFF"/>
-                <w:sz w:val="19"/>
-                <w:szCs w:val="19"/>
-              </w:rPr>
-              <w:t xml:space="preserve">Reason it is left out</w:t>
-            </w:r>
-          </w:p>
-        </w:tc>
-      </w:tr>
-      <w:tr>
-        <w:trPr>
-          <w:cantSplit/>
-        </w:trPr>
-        <w:tc>
-          <w:tcPr>
-            <w:tcW w:type="dxa" w:w="5000"/>
-            <w:tcBorders>
-              <w:top w:val="single" w:color="B8C2D0" w:sz="4"/>
-              <w:left w:val="single" w:color="B8C2D0" w:sz="4"/>
-              <w:bottom w:val="single" w:color="B8C2D0" w:sz="4"/>
-              <w:right w:val="single" w:color="B8C2D0" w:sz="4"/>
-            </w:tcBorders>
-            <w:shd w:fill="FFFFFF" w:color="auto" w:val="clear"/>
-            <w:tcMar>
-              <w:top w:type="dxa" w:w="60"/>
-              <w:left w:type="dxa" w:w="100"/>
-              <w:bottom w:type="dxa" w:w="60"/>
-              <w:right w:type="dxa" w:w="100"/>
-            </w:tcMar>
-          </w:tcPr>
-          <w:p>
-            <w:r>
-              <w:rPr>
-                <w:sz w:val="19"/>
-                <w:szCs w:val="19"/>
-              </w:rPr>
-              <w:t xml:space="preserve">Live network monitoring, intrusion detection and SIEM log collection</w:t>
-            </w:r>
-          </w:p>
-        </w:tc>
-        <w:tc>
-          <w:tcPr>
-            <w:tcW w:type="dxa" w:w="4026"/>
-            <w:tcBorders>
-              <w:top w:val="single" w:color="B8C2D0" w:sz="4"/>
-              <w:left w:val="single" w:color="B8C2D0" w:sz="4"/>
-              <w:bottom w:val="single" w:color="B8C2D0" w:sz="4"/>
-              <w:right w:val="single" w:color="B8C2D0" w:sz="4"/>
-            </w:tcBorders>
-            <w:shd w:fill="FFFFFF" w:color="auto" w:val="clear"/>
-            <w:tcMar>
-              <w:top w:type="dxa" w:w="60"/>
-              <w:left w:type="dxa" w:w="100"/>
-              <w:bottom w:type="dxa" w:w="60"/>
-              <w:right w:type="dxa" w:w="100"/>
-            </w:tcMar>
-          </w:tcPr>
-          <w:p>
-            <w:r>
-              <w:rPr>
-                <w:sz w:val="19"/>
-                <w:szCs w:val="19"/>
-              </w:rPr>
-              <w:t xml:space="preserve">It needs special equipment. This project deals with people and process, not network sensors</w:t>
-            </w:r>
-          </w:p>
-        </w:tc>
-      </w:tr>
-      <w:tr>
-        <w:trPr>
-          <w:cantSplit/>
-        </w:trPr>
-        <w:tc>
-          <w:tcPr>
-            <w:tcW w:type="dxa" w:w="5000"/>
-            <w:tcBorders>
-              <w:top w:val="single" w:color="B8C2D0" w:sz="4"/>
-              <w:left w:val="single" w:color="B8C2D0" w:sz="4"/>
-              <w:bottom w:val="single" w:color="B8C2D0" w:sz="4"/>
-              <w:right w:val="single" w:color="B8C2D0" w:sz="4"/>
-            </w:tcBorders>
-            <w:shd w:fill="FFFFFF" w:color="auto" w:val="clear"/>
-            <w:tcMar>
-              <w:top w:type="dxa" w:w="60"/>
-              <w:left w:type="dxa" w:w="100"/>
-              <w:bottom w:type="dxa" w:w="60"/>
-              <w:right w:type="dxa" w:w="100"/>
-            </w:tcMar>
-          </w:tcPr>
-          <w:p>
-            <w:r>
-              <w:rPr>
-                <w:sz w:val="19"/>
-                <w:szCs w:val="19"/>
-              </w:rPr>
-              <w:t xml:space="preserve">Sending real phishing e-mails to staff</w:t>
-            </w:r>
-          </w:p>
-        </w:tc>
-        <w:tc>
-          <w:tcPr>
-            <w:tcW w:type="dxa" w:w="4026"/>
-            <w:tcBorders>
-              <w:top w:val="single" w:color="B8C2D0" w:sz="4"/>
-              <w:left w:val="single" w:color="B8C2D0" w:sz="4"/>
-              <w:bottom w:val="single" w:color="B8C2D0" w:sz="4"/>
-              <w:right w:val="single" w:color="B8C2D0" w:sz="4"/>
-            </w:tcBorders>
-            <w:shd w:fill="FFFFFF" w:color="auto" w:val="clear"/>
-            <w:tcMar>
-              <w:top w:type="dxa" w:w="60"/>
-              <w:left w:type="dxa" w:w="100"/>
-              <w:bottom w:type="dxa" w:w="60"/>
-              <w:right w:type="dxa" w:w="100"/>
-            </w:tcMar>
-          </w:tcPr>
-          <w:p>
-            <w:r>
-              <w:rPr>
-                <w:sz w:val="19"/>
-                <w:szCs w:val="19"/>
-              </w:rPr>
-              <w:t xml:space="preserve">It has legal and ethical risks. The simulator is an inbox inside the app</w:t>
-            </w:r>
-          </w:p>
-        </w:tc>
-      </w:tr>
-      <w:tr>
-        <w:trPr>
-          <w:cantSplit/>
-        </w:trPr>
-        <w:tc>
-          <w:tcPr>
-            <w:tcW w:type="dxa" w:w="5000"/>
-            <w:tcBorders>
-              <w:top w:val="single" w:color="B8C2D0" w:sz="4"/>
-              <w:left w:val="single" w:color="B8C2D0" w:sz="4"/>
-              <w:bottom w:val="single" w:color="B8C2D0" w:sz="4"/>
-              <w:right w:val="single" w:color="B8C2D0" w:sz="4"/>
-            </w:tcBorders>
-            <w:shd w:fill="FFFFFF" w:color="auto" w:val="clear"/>
-            <w:tcMar>
-              <w:top w:type="dxa" w:w="60"/>
-              <w:left w:type="dxa" w:w="100"/>
-              <w:bottom w:type="dxa" w:w="60"/>
-              <w:right w:type="dxa" w:w="100"/>
-            </w:tcMar>
-          </w:tcPr>
-          <w:p>
-            <w:r>
-              <w:rPr>
-                <w:sz w:val="19"/>
-                <w:szCs w:val="19"/>
-              </w:rPr>
-              <w:t xml:space="preserve">Automatic malware analysis of uploaded files</w:t>
-            </w:r>
-          </w:p>
-        </w:tc>
-        <w:tc>
-          <w:tcPr>
-            <w:tcW w:type="dxa" w:w="4026"/>
-            <w:tcBorders>
-              <w:top w:val="single" w:color="B8C2D0" w:sz="4"/>
-              <w:left w:val="single" w:color="B8C2D0" w:sz="4"/>
-              <w:bottom w:val="single" w:color="B8C2D0" w:sz="4"/>
-              <w:right w:val="single" w:color="B8C2D0" w:sz="4"/>
-            </w:tcBorders>
-            <w:shd w:fill="FFFFFF" w:color="auto" w:val="clear"/>
-            <w:tcMar>
-              <w:top w:type="dxa" w:w="60"/>
-              <w:left w:type="dxa" w:w="100"/>
-              <w:bottom w:type="dxa" w:w="60"/>
-              <w:right w:type="dxa" w:w="100"/>
-            </w:tcMar>
-          </w:tcPr>
-          <w:p>
-            <w:r>
-              <w:rPr>
-                <w:sz w:val="19"/>
-                <w:szCs w:val="19"/>
-              </w:rPr>
-              <w:t xml:space="preserve">It needs special skills and more time. Files are stored but never run</w:t>
-            </w:r>
-          </w:p>
-        </w:tc>
-      </w:tr>
-      <w:tr>
-        <w:trPr>
-          <w:cantSplit/>
-        </w:trPr>
-        <w:tc>
-          <w:tcPr>
-            <w:tcW w:type="dxa" w:w="5000"/>
-            <w:tcBorders>
-              <w:top w:val="single" w:color="B8C2D0" w:sz="4"/>
-              <w:left w:val="single" w:color="B8C2D0" w:sz="4"/>
-              <w:bottom w:val="single" w:color="B8C2D0" w:sz="4"/>
-              <w:right w:val="single" w:color="B8C2D0" w:sz="4"/>
-            </w:tcBorders>
-            <w:shd w:fill="FFFFFF" w:color="auto" w:val="clear"/>
-            <w:tcMar>
-              <w:top w:type="dxa" w:w="60"/>
-              <w:left w:type="dxa" w:w="100"/>
-              <w:bottom w:type="dxa" w:w="60"/>
-              <w:right w:type="dxa" w:w="100"/>
-            </w:tcMar>
-          </w:tcPr>
-          <w:p>
-            <w:r>
-              <w:rPr>
-                <w:sz w:val="19"/>
-                <w:szCs w:val="19"/>
-              </w:rPr>
-              <w:t xml:space="preserve">Single sign-on with HR or directory systems</w:t>
-            </w:r>
-          </w:p>
-        </w:tc>
-        <w:tc>
-          <w:tcPr>
-            <w:tcW w:type="dxa" w:w="4026"/>
-            <w:tcBorders>
-              <w:top w:val="single" w:color="B8C2D0" w:sz="4"/>
-              <w:left w:val="single" w:color="B8C2D0" w:sz="4"/>
-              <w:bottom w:val="single" w:color="B8C2D0" w:sz="4"/>
-              <w:right w:val="single" w:color="B8C2D0" w:sz="4"/>
-            </w:tcBorders>
-            <w:shd w:fill="FFFFFF" w:color="auto" w:val="clear"/>
-            <w:tcMar>
-              <w:top w:type="dxa" w:w="60"/>
-              <w:left w:type="dxa" w:w="100"/>
-              <w:bottom w:type="dxa" w:w="60"/>
-              <w:right w:type="dxa" w:w="100"/>
-            </w:tcMar>
-          </w:tcPr>
-          <w:p>
-            <w:r>
-              <w:rPr>
-                <w:sz w:val="19"/>
-                <w:szCs w:val="19"/>
-              </w:rPr>
-              <w:t xml:space="preserve">Not needed for a first version; accounts are managed inside the system</w:t>
-            </w:r>
-          </w:p>
-        </w:tc>
-      </w:tr>
-      <w:tr>
-        <w:trPr>
-          <w:cantSplit/>
-        </w:trPr>
-        <w:tc>
-          <w:tcPr>
-            <w:tcW w:type="dxa" w:w="5000"/>
-            <w:tcBorders>
-              <w:top w:val="single" w:color="B8C2D0" w:sz="4"/>
-              <w:left w:val="single" w:color="B8C2D0" w:sz="4"/>
-              <w:bottom w:val="single" w:color="B8C2D0" w:sz="4"/>
-              <w:right w:val="single" w:color="B8C2D0" w:sz="4"/>
-            </w:tcBorders>
-            <w:shd w:fill="FFFFFF" w:color="auto" w:val="clear"/>
-            <w:tcMar>
-              <w:top w:type="dxa" w:w="60"/>
-              <w:left w:type="dxa" w:w="100"/>
-              <w:bottom w:type="dxa" w:w="60"/>
-              <w:right w:type="dxa" w:w="100"/>
-            </w:tcMar>
-          </w:tcPr>
-          <w:p>
-            <w:r>
-              <w:rPr>
-                <w:sz w:val="19"/>
-                <w:szCs w:val="19"/>
-              </w:rPr>
-              <w:t xml:space="preserve">Payments or product licensing</w:t>
-            </w:r>
-          </w:p>
-        </w:tc>
-        <w:tc>
-          <w:tcPr>
-            <w:tcW w:type="dxa" w:w="4026"/>
-            <w:tcBorders>
-              <w:top w:val="single" w:color="B8C2D0" w:sz="4"/>
-              <w:left w:val="single" w:color="B8C2D0" w:sz="4"/>
-              <w:bottom w:val="single" w:color="B8C2D0" w:sz="4"/>
-              <w:right w:val="single" w:color="B8C2D0" w:sz="4"/>
-            </w:tcBorders>
-            <w:shd w:fill="FFFFFF" w:color="auto" w:val="clear"/>
-            <w:tcMar>
-              <w:top w:type="dxa" w:w="60"/>
-              <w:left w:type="dxa" w:w="100"/>
-              <w:bottom w:type="dxa" w:w="60"/>
-              <w:right w:type="dxa" w:w="100"/>
-            </w:tcMar>
-          </w:tcPr>
-          <w:p>
-            <w:r>
-              <w:rPr>
-                <w:sz w:val="19"/>
-                <w:szCs w:val="19"/>
-              </w:rPr>
-              <w:t xml:space="preserve">The system is for use inside one organisation</w:t>
-            </w:r>
-          </w:p>
-        </w:tc>
-      </w:tr>
-      <w:tr>
-        <w:trPr>
-          <w:cantSplit/>
-        </w:trPr>
-        <w:tc>
-          <w:tcPr>
-            <w:tcW w:type="dxa" w:w="5000"/>
-            <w:tcBorders>
-              <w:top w:val="single" w:color="B8C2D0" w:sz="4"/>
-              <w:left w:val="single" w:color="B8C2D0" w:sz="4"/>
-              <w:bottom w:val="single" w:color="B8C2D0" w:sz="4"/>
-              <w:right w:val="single" w:color="B8C2D0" w:sz="4"/>
-            </w:tcBorders>
-            <w:shd w:fill="FFFFFF" w:color="auto" w:val="clear"/>
-            <w:tcMar>
-              <w:top w:type="dxa" w:w="60"/>
-              <w:left w:type="dxa" w:w="100"/>
-              <w:bottom w:type="dxa" w:w="60"/>
-              <w:right w:type="dxa" w:w="100"/>
-            </w:tcMar>
-          </w:tcPr>
-          <w:p>
-            <w:r>
-              <w:rPr>
-                <w:sz w:val="19"/>
-                <w:szCs w:val="19"/>
-              </w:rPr>
-              <w:t xml:space="preserve">Desktop programs and an iPhone store release</w:t>
-            </w:r>
-          </w:p>
-        </w:tc>
-        <w:tc>
-          <w:tcPr>
-            <w:tcW w:type="dxa" w:w="4026"/>
-            <w:tcBorders>
-              <w:top w:val="single" w:color="B8C2D0" w:sz="4"/>
-              <w:left w:val="single" w:color="B8C2D0" w:sz="4"/>
-              <w:bottom w:val="single" w:color="B8C2D0" w:sz="4"/>
-              <w:right w:val="single" w:color="B8C2D0" w:sz="4"/>
-            </w:tcBorders>
-            <w:shd w:fill="FFFFFF" w:color="auto" w:val="clear"/>
-            <w:tcMar>
-              <w:top w:type="dxa" w:w="60"/>
-              <w:left w:type="dxa" w:w="100"/>
-              <w:bottom w:type="dxa" w:w="60"/>
-              <w:right w:type="dxa" w:w="100"/>
-            </w:tcMar>
-          </w:tcPr>
-          <w:p>
-            <w:r>
-              <w:rPr>
-                <w:sz w:val="19"/>
-                <w:szCs w:val="19"/>
-              </w:rPr>
-              <w:t xml:space="preserve">The web and Android cover most users in the time available</w:t>
-            </w:r>
-          </w:p>
-        </w:tc>
-      </w:tr>
-    </w:tbl>
-    <w:p>
-      <w:pPr>
-        <w:spacing w:after="120"/>
-      </w:pPr>
-    </w:p>
-    <w:p>
-      <w:pPr>
-        <w:pStyle w:val="Heading1"/>
-      </w:pPr>
-      <w:r>
-        <w:t xml:space="preserve">1.4 Objectives (SMART)</w:t>
-      </w:r>
-    </w:p>
-    <w:p>
-      <w:pPr>
-        <w:spacing w:after="120" w:line="300"/>
-      </w:pPr>
-      <w:r>
-        <w:t xml:space="preserve">Each objective is Specific, Measurable, Achievable, Relevant and Time-bound. The time shown is the week of the project term (about 14 weeks) when the objective is due.</w:t>
-      </w:r>
-    </w:p>
-    <w:p>
-      <w:pPr>
-        <w:keepNext/>
-        <w:spacing w:after="60" w:before="120"/>
-      </w:pPr>
-      <w:r>
-        <w:rPr>
-          <w:b/>
-          <w:bCs/>
-          <w:color w:val="555555"/>
-          <w:sz w:val="19"/>
-          <w:szCs w:val="19"/>
-        </w:rPr>
-        <w:t xml:space="preserve">Table 1.5: SMART objectives</w:t>
+        <w:t xml:space="preserve">Table 1.4: SMART objectives</w:t>
       </w:r>
     </w:p>
     <w:tbl>
@@ -3200,8 +2464,8 @@
       </w:tblPr>
       <w:tblGrid>
         <w:gridCol w:w="600"/>
-        <w:gridCol w:w="3300"/>
-        <w:gridCol w:w="4026"/>
+        <w:gridCol w:w="3000"/>
+        <w:gridCol w:w="4326"/>
         <w:gridCol w:w="1100"/>
       </w:tblGrid>
       <w:tr>
@@ -3240,7 +2504,7 @@
         </w:tc>
         <w:tc>
           <w:tcPr>
-            <w:tcW w:type="dxa" w:w="3300"/>
+            <w:tcW w:type="dxa" w:w="3000"/>
             <w:tcBorders>
               <w:top w:val="single" w:color="B8C2D0" w:sz="4"/>
               <w:left w:val="single" w:color="B8C2D0" w:sz="4"/>
@@ -3270,7 +2534,7 @@
         </w:tc>
         <w:tc>
           <w:tcPr>
-            <w:tcW w:type="dxa" w:w="4026"/>
+            <w:tcW w:type="dxa" w:w="4326"/>
             <w:tcBorders>
               <w:top w:val="single" w:color="B8C2D0" w:sz="4"/>
               <w:left w:val="single" w:color="B8C2D0" w:sz="4"/>
@@ -3362,55 +2626,55 @@
         </w:tc>
         <w:tc>
           <w:tcPr>
-            <w:tcW w:type="dxa" w:w="3300"/>
-            <w:tcBorders>
-              <w:top w:val="single" w:color="B8C2D0" w:sz="4"/>
-              <w:left w:val="single" w:color="B8C2D0" w:sz="4"/>
-              <w:bottom w:val="single" w:color="B8C2D0" w:sz="4"/>
-              <w:right w:val="single" w:color="B8C2D0" w:sz="4"/>
-            </w:tcBorders>
-            <w:shd w:fill="FFFFFF" w:color="auto" w:val="clear"/>
-            <w:tcMar>
-              <w:top w:type="dxa" w:w="60"/>
-              <w:left w:type="dxa" w:w="100"/>
-              <w:bottom w:type="dxa" w:w="60"/>
-              <w:right w:type="dxa" w:w="100"/>
-            </w:tcMar>
-          </w:tcPr>
-          <w:p>
-            <w:r>
-              <w:rPr>
-                <w:sz w:val="19"/>
-                <w:szCs w:val="19"/>
-              </w:rPr>
-              <w:t xml:space="preserve">Give secure login to three roles using JWT tokens and role-based access control</w:t>
-            </w:r>
-          </w:p>
-        </w:tc>
-        <w:tc>
-          <w:tcPr>
-            <w:tcW w:type="dxa" w:w="4026"/>
-            <w:tcBorders>
-              <w:top w:val="single" w:color="B8C2D0" w:sz="4"/>
-              <w:left w:val="single" w:color="B8C2D0" w:sz="4"/>
-              <w:bottom w:val="single" w:color="B8C2D0" w:sz="4"/>
-              <w:right w:val="single" w:color="B8C2D0" w:sz="4"/>
-            </w:tcBorders>
-            <w:shd w:fill="FFFFFF" w:color="auto" w:val="clear"/>
-            <w:tcMar>
-              <w:top w:type="dxa" w:w="60"/>
-              <w:left w:type="dxa" w:w="100"/>
-              <w:bottom w:type="dxa" w:w="60"/>
-              <w:right w:type="dxa" w:w="100"/>
-            </w:tcMar>
-          </w:tcPr>
-          <w:p>
-            <w:r>
-              <w:rPr>
-                <w:sz w:val="19"/>
-                <w:szCs w:val="19"/>
-              </w:rPr>
-              <w:t xml:space="preserve">Every protected endpoint refuses anonymous users and wrong roles (checked by automatic tests)</w:t>
+            <w:tcW w:type="dxa" w:w="3000"/>
+            <w:tcBorders>
+              <w:top w:val="single" w:color="B8C2D0" w:sz="4"/>
+              <w:left w:val="single" w:color="B8C2D0" w:sz="4"/>
+              <w:bottom w:val="single" w:color="B8C2D0" w:sz="4"/>
+              <w:right w:val="single" w:color="B8C2D0" w:sz="4"/>
+            </w:tcBorders>
+            <w:shd w:fill="FFFFFF" w:color="auto" w:val="clear"/>
+            <w:tcMar>
+              <w:top w:type="dxa" w:w="60"/>
+              <w:left w:type="dxa" w:w="100"/>
+              <w:bottom w:type="dxa" w:w="60"/>
+              <w:right w:type="dxa" w:w="100"/>
+            </w:tcMar>
+          </w:tcPr>
+          <w:p>
+            <w:r>
+              <w:rPr>
+                <w:sz w:val="19"/>
+                <w:szCs w:val="19"/>
+              </w:rPr>
+              <w:t xml:space="preserve">Give secure login to two roles using JWT tokens and role-based access control</w:t>
+            </w:r>
+          </w:p>
+        </w:tc>
+        <w:tc>
+          <w:tcPr>
+            <w:tcW w:type="dxa" w:w="4326"/>
+            <w:tcBorders>
+              <w:top w:val="single" w:color="B8C2D0" w:sz="4"/>
+              <w:left w:val="single" w:color="B8C2D0" w:sz="4"/>
+              <w:bottom w:val="single" w:color="B8C2D0" w:sz="4"/>
+              <w:right w:val="single" w:color="B8C2D0" w:sz="4"/>
+            </w:tcBorders>
+            <w:shd w:fill="FFFFFF" w:color="auto" w:val="clear"/>
+            <w:tcMar>
+              <w:top w:type="dxa" w:w="60"/>
+              <w:left w:type="dxa" w:w="100"/>
+              <w:bottom w:type="dxa" w:w="60"/>
+              <w:right w:type="dxa" w:w="100"/>
+            </w:tcMar>
+          </w:tcPr>
+          <w:p>
+            <w:r>
+              <w:rPr>
+                <w:sz w:val="19"/>
+                <w:szCs w:val="19"/>
+              </w:rPr>
+              <w:t xml:space="preserve">Correct login gives tokens. Wrong passwords, deactivated accounts and too many tries are refused. Anonymous users and users with the wrong role are refused on the protected endpoints.</w:t>
             </w:r>
           </w:p>
         </w:tc>
@@ -3475,55 +2739,55 @@
         </w:tc>
         <w:tc>
           <w:tcPr>
-            <w:tcW w:type="dxa" w:w="3300"/>
-            <w:tcBorders>
-              <w:top w:val="single" w:color="B8C2D0" w:sz="4"/>
-              <w:left w:val="single" w:color="B8C2D0" w:sz="4"/>
-              <w:bottom w:val="single" w:color="B8C2D0" w:sz="4"/>
-              <w:right w:val="single" w:color="B8C2D0" w:sz="4"/>
-            </w:tcBorders>
-            <w:shd w:fill="FFFFFF" w:color="auto" w:val="clear"/>
-            <w:tcMar>
-              <w:top w:type="dxa" w:w="60"/>
-              <w:left w:type="dxa" w:w="100"/>
-              <w:bottom w:type="dxa" w:w="60"/>
-              <w:right w:type="dxa" w:w="100"/>
-            </w:tcMar>
-          </w:tcPr>
-          <w:p>
-            <w:r>
-              <w:rPr>
-                <w:sz w:val="19"/>
-                <w:szCs w:val="19"/>
-              </w:rPr>
-              <w:t xml:space="preserve">Provide a training library with progress and bookmarks</w:t>
-            </w:r>
-          </w:p>
-        </w:tc>
-        <w:tc>
-          <w:tcPr>
-            <w:tcW w:type="dxa" w:w="4026"/>
-            <w:tcBorders>
-              <w:top w:val="single" w:color="B8C2D0" w:sz="4"/>
-              <w:left w:val="single" w:color="B8C2D0" w:sz="4"/>
-              <w:bottom w:val="single" w:color="B8C2D0" w:sz="4"/>
-              <w:right w:val="single" w:color="B8C2D0" w:sz="4"/>
-            </w:tcBorders>
-            <w:shd w:fill="FFFFFF" w:color="auto" w:val="clear"/>
-            <w:tcMar>
-              <w:top w:type="dxa" w:w="60"/>
-              <w:left w:type="dxa" w:w="100"/>
-              <w:bottom w:type="dxa" w:w="60"/>
-              <w:right w:type="dxa" w:w="100"/>
-            </w:tcMar>
-          </w:tcPr>
-          <w:p>
-            <w:r>
-              <w:rPr>
-                <w:sz w:val="19"/>
-                <w:szCs w:val="19"/>
-              </w:rPr>
-              <w:t xml:space="preserve">At least 5 categories and 20 lessons loaded; progress saved for each user</w:t>
+            <w:tcW w:type="dxa" w:w="3000"/>
+            <w:tcBorders>
+              <w:top w:val="single" w:color="B8C2D0" w:sz="4"/>
+              <w:left w:val="single" w:color="B8C2D0" w:sz="4"/>
+              <w:bottom w:val="single" w:color="B8C2D0" w:sz="4"/>
+              <w:right w:val="single" w:color="B8C2D0" w:sz="4"/>
+            </w:tcBorders>
+            <w:shd w:fill="FFFFFF" w:color="auto" w:val="clear"/>
+            <w:tcMar>
+              <w:top w:type="dxa" w:w="60"/>
+              <w:left w:type="dxa" w:w="100"/>
+              <w:bottom w:type="dxa" w:w="60"/>
+              <w:right w:type="dxa" w:w="100"/>
+            </w:tcMar>
+          </w:tcPr>
+          <w:p>
+            <w:r>
+              <w:rPr>
+                <w:sz w:val="19"/>
+                <w:szCs w:val="19"/>
+              </w:rPr>
+              <w:t xml:space="preserve">Run quizzes that the server marks automatically</w:t>
+            </w:r>
+          </w:p>
+        </w:tc>
+        <w:tc>
+          <w:tcPr>
+            <w:tcW w:type="dxa" w:w="4326"/>
+            <w:tcBorders>
+              <w:top w:val="single" w:color="B8C2D0" w:sz="4"/>
+              <w:left w:val="single" w:color="B8C2D0" w:sz="4"/>
+              <w:bottom w:val="single" w:color="B8C2D0" w:sz="4"/>
+              <w:right w:val="single" w:color="B8C2D0" w:sz="4"/>
+            </w:tcBorders>
+            <w:shd w:fill="FFFFFF" w:color="auto" w:val="clear"/>
+            <w:tcMar>
+              <w:top w:type="dxa" w:w="60"/>
+              <w:left w:type="dxa" w:w="100"/>
+              <w:bottom w:type="dxa" w:w="60"/>
+              <w:right w:type="dxa" w:w="100"/>
+            </w:tcMar>
+          </w:tcPr>
+          <w:p>
+            <w:r>
+              <w:rPr>
+                <w:sz w:val="19"/>
+                <w:szCs w:val="19"/>
+              </w:rPr>
+              <w:t xml:space="preserve">The server marks the answers. The result shows score, pass or fail, correct answers and tips. The attempt limit is enforced.</w:t>
             </w:r>
           </w:p>
         </w:tc>
@@ -3550,7 +2814,7 @@
                 <w:sz w:val="19"/>
                 <w:szCs w:val="19"/>
               </w:rPr>
-              <w:t xml:space="preserve">Week 6</w:t>
+              <w:t xml:space="preserve">Week 7</w:t>
             </w:r>
           </w:p>
         </w:tc>
@@ -3588,55 +2852,55 @@
         </w:tc>
         <w:tc>
           <w:tcPr>
-            <w:tcW w:type="dxa" w:w="3300"/>
-            <w:tcBorders>
-              <w:top w:val="single" w:color="B8C2D0" w:sz="4"/>
-              <w:left w:val="single" w:color="B8C2D0" w:sz="4"/>
-              <w:bottom w:val="single" w:color="B8C2D0" w:sz="4"/>
-              <w:right w:val="single" w:color="B8C2D0" w:sz="4"/>
-            </w:tcBorders>
-            <w:shd w:fill="FFFFFF" w:color="auto" w:val="clear"/>
-            <w:tcMar>
-              <w:top w:type="dxa" w:w="60"/>
-              <w:left w:type="dxa" w:w="100"/>
-              <w:bottom w:type="dxa" w:w="60"/>
-              <w:right w:type="dxa" w:w="100"/>
-            </w:tcMar>
-          </w:tcPr>
-          <w:p>
-            <w:r>
-              <w:rPr>
-                <w:sz w:val="19"/>
-                <w:szCs w:val="19"/>
-              </w:rPr>
-              <w:t xml:space="preserve">Build a quiz engine that marks automatically</w:t>
-            </w:r>
-          </w:p>
-        </w:tc>
-        <w:tc>
-          <w:tcPr>
-            <w:tcW w:type="dxa" w:w="4026"/>
-            <w:tcBorders>
-              <w:top w:val="single" w:color="B8C2D0" w:sz="4"/>
-              <w:left w:val="single" w:color="B8C2D0" w:sz="4"/>
-              <w:bottom w:val="single" w:color="B8C2D0" w:sz="4"/>
-              <w:right w:val="single" w:color="B8C2D0" w:sz="4"/>
-            </w:tcBorders>
-            <w:shd w:fill="FFFFFF" w:color="auto" w:val="clear"/>
-            <w:tcMar>
-              <w:top w:type="dxa" w:w="60"/>
-              <w:left w:type="dxa" w:w="100"/>
-              <w:bottom w:type="dxa" w:w="60"/>
-              <w:right w:type="dxa" w:w="100"/>
-            </w:tcMar>
-          </w:tcPr>
-          <w:p>
-            <w:r>
-              <w:rPr>
-                <w:sz w:val="19"/>
-                <w:szCs w:val="19"/>
-              </w:rPr>
-              <w:t xml:space="preserve">Quiz is marked in under 2 seconds; pass or fail and weak topics are shown</w:t>
+            <w:tcW w:type="dxa" w:w="3000"/>
+            <w:tcBorders>
+              <w:top w:val="single" w:color="B8C2D0" w:sz="4"/>
+              <w:left w:val="single" w:color="B8C2D0" w:sz="4"/>
+              <w:bottom w:val="single" w:color="B8C2D0" w:sz="4"/>
+              <w:right w:val="single" w:color="B8C2D0" w:sz="4"/>
+            </w:tcBorders>
+            <w:shd w:fill="FFFFFF" w:color="auto" w:val="clear"/>
+            <w:tcMar>
+              <w:top w:type="dxa" w:w="60"/>
+              <w:left w:type="dxa" w:w="100"/>
+              <w:bottom w:type="dxa" w:w="60"/>
+              <w:right w:type="dxa" w:w="100"/>
+            </w:tcMar>
+          </w:tcPr>
+          <w:p>
+            <w:r>
+              <w:rPr>
+                <w:sz w:val="19"/>
+                <w:szCs w:val="19"/>
+              </w:rPr>
+              <w:t xml:space="preserve">Let users report incidents with evidence</w:t>
+            </w:r>
+          </w:p>
+        </w:tc>
+        <w:tc>
+          <w:tcPr>
+            <w:tcW w:type="dxa" w:w="4326"/>
+            <w:tcBorders>
+              <w:top w:val="single" w:color="B8C2D0" w:sz="4"/>
+              <w:left w:val="single" w:color="B8C2D0" w:sz="4"/>
+              <w:bottom w:val="single" w:color="B8C2D0" w:sz="4"/>
+              <w:right w:val="single" w:color="B8C2D0" w:sz="4"/>
+            </w:tcBorders>
+            <w:shd w:fill="FFFFFF" w:color="auto" w:val="clear"/>
+            <w:tcMar>
+              <w:top w:type="dxa" w:w="60"/>
+              <w:left w:type="dxa" w:w="100"/>
+              <w:bottom w:type="dxa" w:w="60"/>
+              <w:right w:type="dxa" w:w="100"/>
+            </w:tcMar>
+          </w:tcPr>
+          <w:p>
+            <w:r>
+              <w:rPr>
+                <w:sz w:val="19"/>
+                <w:szCs w:val="19"/>
+              </w:rPr>
+              <w:t xml:space="preserve">Each report gets a unique reference number. Drafts can be saved. Only allowed file types up to 10 MB are accepted.</w:t>
             </w:r>
           </w:p>
         </w:tc>
@@ -3663,7 +2927,7 @@
                 <w:sz w:val="19"/>
                 <w:szCs w:val="19"/>
               </w:rPr>
-              <w:t xml:space="preserve">Week 7</w:t>
+              <w:t xml:space="preserve">Week 9</w:t>
             </w:r>
           </w:p>
         </w:tc>
@@ -3701,55 +2965,55 @@
         </w:tc>
         <w:tc>
           <w:tcPr>
-            <w:tcW w:type="dxa" w:w="3300"/>
-            <w:tcBorders>
-              <w:top w:val="single" w:color="B8C2D0" w:sz="4"/>
-              <w:left w:val="single" w:color="B8C2D0" w:sz="4"/>
-              <w:bottom w:val="single" w:color="B8C2D0" w:sz="4"/>
-              <w:right w:val="single" w:color="B8C2D0" w:sz="4"/>
-            </w:tcBorders>
-            <w:shd w:fill="FFFFFF" w:color="auto" w:val="clear"/>
-            <w:tcMar>
-              <w:top w:type="dxa" w:w="60"/>
-              <w:left w:type="dxa" w:w="100"/>
-              <w:bottom w:type="dxa" w:w="60"/>
-              <w:right w:type="dxa" w:w="100"/>
-            </w:tcMar>
-          </w:tcPr>
-          <w:p>
-            <w:r>
-              <w:rPr>
-                <w:sz w:val="19"/>
-                <w:szCs w:val="19"/>
-              </w:rPr>
-              <w:t xml:space="preserve">Build a phishing simulator with scored feedback</w:t>
-            </w:r>
-          </w:p>
-        </w:tc>
-        <w:tc>
-          <w:tcPr>
-            <w:tcW w:type="dxa" w:w="4026"/>
-            <w:tcBorders>
-              <w:top w:val="single" w:color="B8C2D0" w:sz="4"/>
-              <w:left w:val="single" w:color="B8C2D0" w:sz="4"/>
-              <w:bottom w:val="single" w:color="B8C2D0" w:sz="4"/>
-              <w:right w:val="single" w:color="B8C2D0" w:sz="4"/>
-            </w:tcBorders>
-            <w:shd w:fill="FFFFFF" w:color="auto" w:val="clear"/>
-            <w:tcMar>
-              <w:top w:type="dxa" w:w="60"/>
-              <w:left w:type="dxa" w:w="100"/>
-              <w:bottom w:type="dxa" w:w="60"/>
-              <w:right w:type="dxa" w:w="100"/>
-            </w:tcMar>
-          </w:tcPr>
-          <w:p>
-            <w:r>
-              <w:rPr>
-                <w:sz w:val="19"/>
-                <w:szCs w:val="19"/>
-              </w:rPr>
-              <w:t xml:space="preserve">Each scenario gets a score from 0 to 100</w:t>
+            <w:tcW w:type="dxa" w:w="3000"/>
+            <w:tcBorders>
+              <w:top w:val="single" w:color="B8C2D0" w:sz="4"/>
+              <w:left w:val="single" w:color="B8C2D0" w:sz="4"/>
+              <w:bottom w:val="single" w:color="B8C2D0" w:sz="4"/>
+              <w:right w:val="single" w:color="B8C2D0" w:sz="4"/>
+            </w:tcBorders>
+            <w:shd w:fill="FFFFFF" w:color="auto" w:val="clear"/>
+            <w:tcMar>
+              <w:top w:type="dxa" w:w="60"/>
+              <w:left w:type="dxa" w:w="100"/>
+              <w:bottom w:type="dxa" w:w="60"/>
+              <w:right w:type="dxa" w:w="100"/>
+            </w:tcMar>
+          </w:tcPr>
+          <w:p>
+            <w:r>
+              <w:rPr>
+                <w:sz w:val="19"/>
+                <w:szCs w:val="19"/>
+              </w:rPr>
+              <w:t xml:space="preserve">Give administrators a queue with assignment and status flow</w:t>
+            </w:r>
+          </w:p>
+        </w:tc>
+        <w:tc>
+          <w:tcPr>
+            <w:tcW w:type="dxa" w:w="4326"/>
+            <w:tcBorders>
+              <w:top w:val="single" w:color="B8C2D0" w:sz="4"/>
+              <w:left w:val="single" w:color="B8C2D0" w:sz="4"/>
+              <w:bottom w:val="single" w:color="B8C2D0" w:sz="4"/>
+              <w:right w:val="single" w:color="B8C2D0" w:sz="4"/>
+            </w:tcBorders>
+            <w:shd w:fill="FFFFFF" w:color="auto" w:val="clear"/>
+            <w:tcMar>
+              <w:top w:type="dxa" w:w="60"/>
+              <w:left w:type="dxa" w:w="100"/>
+              <w:bottom w:type="dxa" w:w="60"/>
+              <w:right w:type="dxa" w:w="100"/>
+            </w:tcMar>
+          </w:tcPr>
+          <w:p>
+            <w:r>
+              <w:rPr>
+                <w:sz w:val="19"/>
+                <w:szCs w:val="19"/>
+              </w:rPr>
+              <w:t xml:space="preserve">Administrators assign an incident and change its status. Every change is on a timeline that the reporter sees. Normal users are refused.</w:t>
             </w:r>
           </w:p>
         </w:tc>
@@ -3776,7 +3040,7 @@
                 <w:sz w:val="19"/>
                 <w:szCs w:val="19"/>
               </w:rPr>
-              <w:t xml:space="preserve">Week 8</w:t>
+              <w:t xml:space="preserve">Week 10</w:t>
             </w:r>
           </w:p>
         </w:tc>
@@ -3814,55 +3078,55 @@
         </w:tc>
         <w:tc>
           <w:tcPr>
-            <w:tcW w:type="dxa" w:w="3300"/>
-            <w:tcBorders>
-              <w:top w:val="single" w:color="B8C2D0" w:sz="4"/>
-              <w:left w:val="single" w:color="B8C2D0" w:sz="4"/>
-              <w:bottom w:val="single" w:color="B8C2D0" w:sz="4"/>
-              <w:right w:val="single" w:color="B8C2D0" w:sz="4"/>
-            </w:tcBorders>
-            <w:shd w:fill="FFFFFF" w:color="auto" w:val="clear"/>
-            <w:tcMar>
-              <w:top w:type="dxa" w:w="60"/>
-              <w:left w:type="dxa" w:w="100"/>
-              <w:bottom w:type="dxa" w:w="60"/>
-              <w:right w:type="dxa" w:w="100"/>
-            </w:tcMar>
-          </w:tcPr>
-          <w:p>
-            <w:r>
-              <w:rPr>
-                <w:sz w:val="19"/>
-                <w:szCs w:val="19"/>
-              </w:rPr>
-              <w:t xml:space="preserve">Let users report incidents with evidence</w:t>
-            </w:r>
-          </w:p>
-        </w:tc>
-        <w:tc>
-          <w:tcPr>
-            <w:tcW w:type="dxa" w:w="4026"/>
-            <w:tcBorders>
-              <w:top w:val="single" w:color="B8C2D0" w:sz="4"/>
-              <w:left w:val="single" w:color="B8C2D0" w:sz="4"/>
-              <w:bottom w:val="single" w:color="B8C2D0" w:sz="4"/>
-              <w:right w:val="single" w:color="B8C2D0" w:sz="4"/>
-            </w:tcBorders>
-            <w:shd w:fill="FFFFFF" w:color="auto" w:val="clear"/>
-            <w:tcMar>
-              <w:top w:type="dxa" w:w="60"/>
-              <w:left w:type="dxa" w:w="100"/>
-              <w:bottom w:type="dxa" w:w="60"/>
-              <w:right w:type="dxa" w:w="100"/>
-            </w:tcMar>
-          </w:tcPr>
-          <w:p>
-            <w:r>
-              <w:rPr>
-                <w:sz w:val="19"/>
-                <w:szCs w:val="19"/>
-              </w:rPr>
-              <w:t xml:space="preserve">Each report gets a unique reference number; only allowed file types up to 10 MB are accepted</w:t>
+            <w:tcW w:type="dxa" w:w="3000"/>
+            <w:tcBorders>
+              <w:top w:val="single" w:color="B8C2D0" w:sz="4"/>
+              <w:left w:val="single" w:color="B8C2D0" w:sz="4"/>
+              <w:bottom w:val="single" w:color="B8C2D0" w:sz="4"/>
+              <w:right w:val="single" w:color="B8C2D0" w:sz="4"/>
+            </w:tcBorders>
+            <w:shd w:fill="FFFFFF" w:color="auto" w:val="clear"/>
+            <w:tcMar>
+              <w:top w:type="dxa" w:w="60"/>
+              <w:left w:type="dxa" w:w="100"/>
+              <w:bottom w:type="dxa" w:w="60"/>
+              <w:right w:type="dxa" w:w="100"/>
+            </w:tcMar>
+          </w:tcPr>
+          <w:p>
+            <w:r>
+              <w:rPr>
+                <w:sz w:val="19"/>
+                <w:szCs w:val="19"/>
+              </w:rPr>
+              <w:t xml:space="preserve">Record data-changing requests in an audit log</w:t>
+            </w:r>
+          </w:p>
+        </w:tc>
+        <w:tc>
+          <w:tcPr>
+            <w:tcW w:type="dxa" w:w="4326"/>
+            <w:tcBorders>
+              <w:top w:val="single" w:color="B8C2D0" w:sz="4"/>
+              <w:left w:val="single" w:color="B8C2D0" w:sz="4"/>
+              <w:bottom w:val="single" w:color="B8C2D0" w:sz="4"/>
+              <w:right w:val="single" w:color="B8C2D0" w:sz="4"/>
+            </w:tcBorders>
+            <w:shd w:fill="FFFFFF" w:color="auto" w:val="clear"/>
+            <w:tcMar>
+              <w:top w:type="dxa" w:w="60"/>
+              <w:left w:type="dxa" w:w="100"/>
+              <w:bottom w:type="dxa" w:w="60"/>
+              <w:right w:type="dxa" w:w="100"/>
+            </w:tcMar>
+          </w:tcPr>
+          <w:p>
+            <w:r>
+              <w:rPr>
+                <w:sz w:val="19"/>
+                <w:szCs w:val="19"/>
+              </w:rPr>
+              <w:t xml:space="preserve">Signed-in data-changing requests are logged. Read-only requests are not. Administrators view the log and export it as a CSV file.</w:t>
             </w:r>
           </w:p>
         </w:tc>
@@ -3889,572 +3153,7 @@
                 <w:sz w:val="19"/>
                 <w:szCs w:val="19"/>
               </w:rPr>
-              <w:t xml:space="preserve">Week 9</w:t>
-            </w:r>
-          </w:p>
-        </w:tc>
-      </w:tr>
-      <w:tr>
-        <w:trPr>
-          <w:cantSplit/>
-        </w:trPr>
-        <w:tc>
-          <w:tcPr>
-            <w:tcW w:type="dxa" w:w="600"/>
-            <w:tcBorders>
-              <w:top w:val="single" w:color="B8C2D0" w:sz="4"/>
-              <w:left w:val="single" w:color="B8C2D0" w:sz="4"/>
-              <w:bottom w:val="single" w:color="B8C2D0" w:sz="4"/>
-              <w:right w:val="single" w:color="B8C2D0" w:sz="4"/>
-            </w:tcBorders>
-            <w:shd w:fill="FFFFFF" w:color="auto" w:val="clear"/>
-            <w:tcMar>
-              <w:top w:type="dxa" w:w="60"/>
-              <w:left w:type="dxa" w:w="100"/>
-              <w:bottom w:type="dxa" w:w="60"/>
-              <w:right w:type="dxa" w:w="100"/>
-            </w:tcMar>
-          </w:tcPr>
-          <w:p>
-            <w:r>
-              <w:rPr>
-                <w:sz w:val="19"/>
-                <w:szCs w:val="19"/>
-              </w:rPr>
-              <w:t xml:space="preserve">O6</w:t>
-            </w:r>
-          </w:p>
-        </w:tc>
-        <w:tc>
-          <w:tcPr>
-            <w:tcW w:type="dxa" w:w="3300"/>
-            <w:tcBorders>
-              <w:top w:val="single" w:color="B8C2D0" w:sz="4"/>
-              <w:left w:val="single" w:color="B8C2D0" w:sz="4"/>
-              <w:bottom w:val="single" w:color="B8C2D0" w:sz="4"/>
-              <w:right w:val="single" w:color="B8C2D0" w:sz="4"/>
-            </w:tcBorders>
-            <w:shd w:fill="FFFFFF" w:color="auto" w:val="clear"/>
-            <w:tcMar>
-              <w:top w:type="dxa" w:w="60"/>
-              <w:left w:type="dxa" w:w="100"/>
-              <w:bottom w:type="dxa" w:w="60"/>
-              <w:right w:type="dxa" w:w="100"/>
-            </w:tcMar>
-          </w:tcPr>
-          <w:p>
-            <w:r>
-              <w:rPr>
-                <w:sz w:val="19"/>
-                <w:szCs w:val="19"/>
-              </w:rPr>
-              <w:t xml:space="preserve">Give officers a queue with assignment and status flow</w:t>
-            </w:r>
-          </w:p>
-        </w:tc>
-        <w:tc>
-          <w:tcPr>
-            <w:tcW w:type="dxa" w:w="4026"/>
-            <w:tcBorders>
-              <w:top w:val="single" w:color="B8C2D0" w:sz="4"/>
-              <w:left w:val="single" w:color="B8C2D0" w:sz="4"/>
-              <w:bottom w:val="single" w:color="B8C2D0" w:sz="4"/>
-              <w:right w:val="single" w:color="B8C2D0" w:sz="4"/>
-            </w:tcBorders>
-            <w:shd w:fill="FFFFFF" w:color="auto" w:val="clear"/>
-            <w:tcMar>
-              <w:top w:type="dxa" w:w="60"/>
-              <w:left w:type="dxa" w:w="100"/>
-              <w:bottom w:type="dxa" w:w="60"/>
-              <w:right w:type="dxa" w:w="100"/>
-            </w:tcMar>
-          </w:tcPr>
-          <w:p>
-            <w:r>
-              <w:rPr>
-                <w:sz w:val="19"/>
-                <w:szCs w:val="19"/>
-              </w:rPr>
-              <w:t xml:space="preserve">Every status change and assignment is written to a timeline</w:t>
-            </w:r>
-          </w:p>
-        </w:tc>
-        <w:tc>
-          <w:tcPr>
-            <w:tcW w:type="dxa" w:w="1100"/>
-            <w:tcBorders>
-              <w:top w:val="single" w:color="B8C2D0" w:sz="4"/>
-              <w:left w:val="single" w:color="B8C2D0" w:sz="4"/>
-              <w:bottom w:val="single" w:color="B8C2D0" w:sz="4"/>
-              <w:right w:val="single" w:color="B8C2D0" w:sz="4"/>
-            </w:tcBorders>
-            <w:shd w:fill="FFFFFF" w:color="auto" w:val="clear"/>
-            <w:tcMar>
-              <w:top w:type="dxa" w:w="60"/>
-              <w:left w:type="dxa" w:w="100"/>
-              <w:bottom w:type="dxa" w:w="60"/>
-              <w:right w:type="dxa" w:w="100"/>
-            </w:tcMar>
-          </w:tcPr>
-          <w:p>
-            <w:r>
-              <w:rPr>
-                <w:sz w:val="19"/>
-                <w:szCs w:val="19"/>
-              </w:rPr>
-              <w:t xml:space="preserve">Week 10</w:t>
-            </w:r>
-          </w:p>
-        </w:tc>
-      </w:tr>
-      <w:tr>
-        <w:trPr>
-          <w:cantSplit/>
-        </w:trPr>
-        <w:tc>
-          <w:tcPr>
-            <w:tcW w:type="dxa" w:w="600"/>
-            <w:tcBorders>
-              <w:top w:val="single" w:color="B8C2D0" w:sz="4"/>
-              <w:left w:val="single" w:color="B8C2D0" w:sz="4"/>
-              <w:bottom w:val="single" w:color="B8C2D0" w:sz="4"/>
-              <w:right w:val="single" w:color="B8C2D0" w:sz="4"/>
-            </w:tcBorders>
-            <w:shd w:fill="FFFFFF" w:color="auto" w:val="clear"/>
-            <w:tcMar>
-              <w:top w:type="dxa" w:w="60"/>
-              <w:left w:type="dxa" w:w="100"/>
-              <w:bottom w:type="dxa" w:w="60"/>
-              <w:right w:type="dxa" w:w="100"/>
-            </w:tcMar>
-          </w:tcPr>
-          <w:p>
-            <w:r>
-              <w:rPr>
-                <w:sz w:val="19"/>
-                <w:szCs w:val="19"/>
-              </w:rPr>
-              <w:t xml:space="preserve">O7</w:t>
-            </w:r>
-          </w:p>
-        </w:tc>
-        <w:tc>
-          <w:tcPr>
-            <w:tcW w:type="dxa" w:w="3300"/>
-            <w:tcBorders>
-              <w:top w:val="single" w:color="B8C2D0" w:sz="4"/>
-              <w:left w:val="single" w:color="B8C2D0" w:sz="4"/>
-              <w:bottom w:val="single" w:color="B8C2D0" w:sz="4"/>
-              <w:right w:val="single" w:color="B8C2D0" w:sz="4"/>
-            </w:tcBorders>
-            <w:shd w:fill="FFFFFF" w:color="auto" w:val="clear"/>
-            <w:tcMar>
-              <w:top w:type="dxa" w:w="60"/>
-              <w:left w:type="dxa" w:w="100"/>
-              <w:bottom w:type="dxa" w:w="60"/>
-              <w:right w:type="dxa" w:w="100"/>
-            </w:tcMar>
-          </w:tcPr>
-          <w:p>
-            <w:r>
-              <w:rPr>
-                <w:sz w:val="19"/>
-                <w:szCs w:val="19"/>
-              </w:rPr>
-              <w:t xml:space="preserve">Provide analytics and alerts</w:t>
-            </w:r>
-          </w:p>
-        </w:tc>
-        <w:tc>
-          <w:tcPr>
-            <w:tcW w:type="dxa" w:w="4026"/>
-            <w:tcBorders>
-              <w:top w:val="single" w:color="B8C2D0" w:sz="4"/>
-              <w:left w:val="single" w:color="B8C2D0" w:sz="4"/>
-              <w:bottom w:val="single" w:color="B8C2D0" w:sz="4"/>
-              <w:right w:val="single" w:color="B8C2D0" w:sz="4"/>
-            </w:tcBorders>
-            <w:shd w:fill="FFFFFF" w:color="auto" w:val="clear"/>
-            <w:tcMar>
-              <w:top w:type="dxa" w:w="60"/>
-              <w:left w:type="dxa" w:w="100"/>
-              <w:bottom w:type="dxa" w:w="60"/>
-              <w:right w:type="dxa" w:w="100"/>
-            </w:tcMar>
-          </w:tcPr>
-          <w:p>
-            <w:r>
-              <w:rPr>
-                <w:sz w:val="19"/>
-                <w:szCs w:val="19"/>
-              </w:rPr>
-              <w:t xml:space="preserve">Personal and organisation dashboards work; an alert reaches all active users of its audience</w:t>
-            </w:r>
-          </w:p>
-        </w:tc>
-        <w:tc>
-          <w:tcPr>
-            <w:tcW w:type="dxa" w:w="1100"/>
-            <w:tcBorders>
-              <w:top w:val="single" w:color="B8C2D0" w:sz="4"/>
-              <w:left w:val="single" w:color="B8C2D0" w:sz="4"/>
-              <w:bottom w:val="single" w:color="B8C2D0" w:sz="4"/>
-              <w:right w:val="single" w:color="B8C2D0" w:sz="4"/>
-            </w:tcBorders>
-            <w:shd w:fill="FFFFFF" w:color="auto" w:val="clear"/>
-            <w:tcMar>
-              <w:top w:type="dxa" w:w="60"/>
-              <w:left w:type="dxa" w:w="100"/>
-              <w:bottom w:type="dxa" w:w="60"/>
-              <w:right w:type="dxa" w:w="100"/>
-            </w:tcMar>
-          </w:tcPr>
-          <w:p>
-            <w:r>
-              <w:rPr>
-                <w:sz w:val="19"/>
-                <w:szCs w:val="19"/>
-              </w:rPr>
               <w:t xml:space="preserve">Week 11</w:t>
-            </w:r>
-          </w:p>
-        </w:tc>
-      </w:tr>
-      <w:tr>
-        <w:trPr>
-          <w:cantSplit/>
-        </w:trPr>
-        <w:tc>
-          <w:tcPr>
-            <w:tcW w:type="dxa" w:w="600"/>
-            <w:tcBorders>
-              <w:top w:val="single" w:color="B8C2D0" w:sz="4"/>
-              <w:left w:val="single" w:color="B8C2D0" w:sz="4"/>
-              <w:bottom w:val="single" w:color="B8C2D0" w:sz="4"/>
-              <w:right w:val="single" w:color="B8C2D0" w:sz="4"/>
-            </w:tcBorders>
-            <w:shd w:fill="FFFFFF" w:color="auto" w:val="clear"/>
-            <w:tcMar>
-              <w:top w:type="dxa" w:w="60"/>
-              <w:left w:type="dxa" w:w="100"/>
-              <w:bottom w:type="dxa" w:w="60"/>
-              <w:right w:type="dxa" w:w="100"/>
-            </w:tcMar>
-          </w:tcPr>
-          <w:p>
-            <w:r>
-              <w:rPr>
-                <w:sz w:val="19"/>
-                <w:szCs w:val="19"/>
-              </w:rPr>
-              <w:t xml:space="preserve">O8</w:t>
-            </w:r>
-          </w:p>
-        </w:tc>
-        <w:tc>
-          <w:tcPr>
-            <w:tcW w:type="dxa" w:w="3300"/>
-            <w:tcBorders>
-              <w:top w:val="single" w:color="B8C2D0" w:sz="4"/>
-              <w:left w:val="single" w:color="B8C2D0" w:sz="4"/>
-              <w:bottom w:val="single" w:color="B8C2D0" w:sz="4"/>
-              <w:right w:val="single" w:color="B8C2D0" w:sz="4"/>
-            </w:tcBorders>
-            <w:shd w:fill="FFFFFF" w:color="auto" w:val="clear"/>
-            <w:tcMar>
-              <w:top w:type="dxa" w:w="60"/>
-              <w:left w:type="dxa" w:w="100"/>
-              <w:bottom w:type="dxa" w:w="60"/>
-              <w:right w:type="dxa" w:w="100"/>
-            </w:tcMar>
-          </w:tcPr>
-          <w:p>
-            <w:r>
-              <w:rPr>
-                <w:sz w:val="19"/>
-                <w:szCs w:val="19"/>
-              </w:rPr>
-              <w:t xml:space="preserve">Record every data-changing request in an audit log</w:t>
-            </w:r>
-          </w:p>
-        </w:tc>
-        <w:tc>
-          <w:tcPr>
-            <w:tcW w:type="dxa" w:w="4026"/>
-            <w:tcBorders>
-              <w:top w:val="single" w:color="B8C2D0" w:sz="4"/>
-              <w:left w:val="single" w:color="B8C2D0" w:sz="4"/>
-              <w:bottom w:val="single" w:color="B8C2D0" w:sz="4"/>
-              <w:right w:val="single" w:color="B8C2D0" w:sz="4"/>
-            </w:tcBorders>
-            <w:shd w:fill="FFFFFF" w:color="auto" w:val="clear"/>
-            <w:tcMar>
-              <w:top w:type="dxa" w:w="60"/>
-              <w:left w:type="dxa" w:w="100"/>
-              <w:bottom w:type="dxa" w:w="60"/>
-              <w:right w:type="dxa" w:w="100"/>
-            </w:tcMar>
-          </w:tcPr>
-          <w:p>
-            <w:r>
-              <w:rPr>
-                <w:sz w:val="19"/>
-                <w:szCs w:val="19"/>
-              </w:rPr>
-              <w:t xml:space="preserve">An audit entry exists for every signed-in POST, PUT, PATCH and DELETE request; CSV export works</w:t>
-            </w:r>
-          </w:p>
-        </w:tc>
-        <w:tc>
-          <w:tcPr>
-            <w:tcW w:type="dxa" w:w="1100"/>
-            <w:tcBorders>
-              <w:top w:val="single" w:color="B8C2D0" w:sz="4"/>
-              <w:left w:val="single" w:color="B8C2D0" w:sz="4"/>
-              <w:bottom w:val="single" w:color="B8C2D0" w:sz="4"/>
-              <w:right w:val="single" w:color="B8C2D0" w:sz="4"/>
-            </w:tcBorders>
-            <w:shd w:fill="FFFFFF" w:color="auto" w:val="clear"/>
-            <w:tcMar>
-              <w:top w:type="dxa" w:w="60"/>
-              <w:left w:type="dxa" w:w="100"/>
-              <w:bottom w:type="dxa" w:w="60"/>
-              <w:right w:type="dxa" w:w="100"/>
-            </w:tcMar>
-          </w:tcPr>
-          <w:p>
-            <w:r>
-              <w:rPr>
-                <w:sz w:val="19"/>
-                <w:szCs w:val="19"/>
-              </w:rPr>
-              <w:t xml:space="preserve">Week 11</w:t>
-            </w:r>
-          </w:p>
-        </w:tc>
-      </w:tr>
-      <w:tr>
-        <w:trPr>
-          <w:cantSplit/>
-        </w:trPr>
-        <w:tc>
-          <w:tcPr>
-            <w:tcW w:type="dxa" w:w="600"/>
-            <w:tcBorders>
-              <w:top w:val="single" w:color="B8C2D0" w:sz="4"/>
-              <w:left w:val="single" w:color="B8C2D0" w:sz="4"/>
-              <w:bottom w:val="single" w:color="B8C2D0" w:sz="4"/>
-              <w:right w:val="single" w:color="B8C2D0" w:sz="4"/>
-            </w:tcBorders>
-            <w:shd w:fill="FFFFFF" w:color="auto" w:val="clear"/>
-            <w:tcMar>
-              <w:top w:type="dxa" w:w="60"/>
-              <w:left w:type="dxa" w:w="100"/>
-              <w:bottom w:type="dxa" w:w="60"/>
-              <w:right w:type="dxa" w:w="100"/>
-            </w:tcMar>
-          </w:tcPr>
-          <w:p>
-            <w:r>
-              <w:rPr>
-                <w:sz w:val="19"/>
-                <w:szCs w:val="19"/>
-              </w:rPr>
-              <w:t xml:space="preserve">O9</w:t>
-            </w:r>
-          </w:p>
-        </w:tc>
-        <w:tc>
-          <w:tcPr>
-            <w:tcW w:type="dxa" w:w="3300"/>
-            <w:tcBorders>
-              <w:top w:val="single" w:color="B8C2D0" w:sz="4"/>
-              <w:left w:val="single" w:color="B8C2D0" w:sz="4"/>
-              <w:bottom w:val="single" w:color="B8C2D0" w:sz="4"/>
-              <w:right w:val="single" w:color="B8C2D0" w:sz="4"/>
-            </w:tcBorders>
-            <w:shd w:fill="FFFFFF" w:color="auto" w:val="clear"/>
-            <w:tcMar>
-              <w:top w:type="dxa" w:w="60"/>
-              <w:left w:type="dxa" w:w="100"/>
-              <w:bottom w:type="dxa" w:w="60"/>
-              <w:right w:type="dxa" w:w="100"/>
-            </w:tcMar>
-          </w:tcPr>
-          <w:p>
-            <w:r>
-              <w:rPr>
-                <w:sz w:val="19"/>
-                <w:szCs w:val="19"/>
-              </w:rPr>
-              <w:t xml:space="preserve">Prove quality with automatic tests</w:t>
-            </w:r>
-          </w:p>
-        </w:tc>
-        <w:tc>
-          <w:tcPr>
-            <w:tcW w:type="dxa" w:w="4026"/>
-            <w:tcBorders>
-              <w:top w:val="single" w:color="B8C2D0" w:sz="4"/>
-              <w:left w:val="single" w:color="B8C2D0" w:sz="4"/>
-              <w:bottom w:val="single" w:color="B8C2D0" w:sz="4"/>
-              <w:right w:val="single" w:color="B8C2D0" w:sz="4"/>
-            </w:tcBorders>
-            <w:shd w:fill="FFFFFF" w:color="auto" w:val="clear"/>
-            <w:tcMar>
-              <w:top w:type="dxa" w:w="60"/>
-              <w:left w:type="dxa" w:w="100"/>
-              <w:bottom w:type="dxa" w:w="60"/>
-              <w:right w:type="dxa" w:w="100"/>
-            </w:tcMar>
-          </w:tcPr>
-          <w:p>
-            <w:r>
-              <w:rPr>
-                <w:sz w:val="19"/>
-                <w:szCs w:val="19"/>
-              </w:rPr>
-              <w:t xml:space="preserve">At least 300 automatic tests pass with no failures</w:t>
-            </w:r>
-          </w:p>
-        </w:tc>
-        <w:tc>
-          <w:tcPr>
-            <w:tcW w:type="dxa" w:w="1100"/>
-            <w:tcBorders>
-              <w:top w:val="single" w:color="B8C2D0" w:sz="4"/>
-              <w:left w:val="single" w:color="B8C2D0" w:sz="4"/>
-              <w:bottom w:val="single" w:color="B8C2D0" w:sz="4"/>
-              <w:right w:val="single" w:color="B8C2D0" w:sz="4"/>
-            </w:tcBorders>
-            <w:shd w:fill="FFFFFF" w:color="auto" w:val="clear"/>
-            <w:tcMar>
-              <w:top w:type="dxa" w:w="60"/>
-              <w:left w:type="dxa" w:w="100"/>
-              <w:bottom w:type="dxa" w:w="60"/>
-              <w:right w:type="dxa" w:w="100"/>
-            </w:tcMar>
-          </w:tcPr>
-          <w:p>
-            <w:r>
-              <w:rPr>
-                <w:sz w:val="19"/>
-                <w:szCs w:val="19"/>
-              </w:rPr>
-              <w:t xml:space="preserve">Week 12</w:t>
-            </w:r>
-          </w:p>
-        </w:tc>
-      </w:tr>
-      <w:tr>
-        <w:trPr>
-          <w:cantSplit/>
-        </w:trPr>
-        <w:tc>
-          <w:tcPr>
-            <w:tcW w:type="dxa" w:w="600"/>
-            <w:tcBorders>
-              <w:top w:val="single" w:color="B8C2D0" w:sz="4"/>
-              <w:left w:val="single" w:color="B8C2D0" w:sz="4"/>
-              <w:bottom w:val="single" w:color="B8C2D0" w:sz="4"/>
-              <w:right w:val="single" w:color="B8C2D0" w:sz="4"/>
-            </w:tcBorders>
-            <w:shd w:fill="FFFFFF" w:color="auto" w:val="clear"/>
-            <w:tcMar>
-              <w:top w:type="dxa" w:w="60"/>
-              <w:left w:type="dxa" w:w="100"/>
-              <w:bottom w:type="dxa" w:w="60"/>
-              <w:right w:type="dxa" w:w="100"/>
-            </w:tcMar>
-          </w:tcPr>
-          <w:p>
-            <w:r>
-              <w:rPr>
-                <w:sz w:val="19"/>
-                <w:szCs w:val="19"/>
-              </w:rPr>
-              <w:t xml:space="preserve">O10</w:t>
-            </w:r>
-          </w:p>
-        </w:tc>
-        <w:tc>
-          <w:tcPr>
-            <w:tcW w:type="dxa" w:w="3300"/>
-            <w:tcBorders>
-              <w:top w:val="single" w:color="B8C2D0" w:sz="4"/>
-              <w:left w:val="single" w:color="B8C2D0" w:sz="4"/>
-              <w:bottom w:val="single" w:color="B8C2D0" w:sz="4"/>
-              <w:right w:val="single" w:color="B8C2D0" w:sz="4"/>
-            </w:tcBorders>
-            <w:shd w:fill="FFFFFF" w:color="auto" w:val="clear"/>
-            <w:tcMar>
-              <w:top w:type="dxa" w:w="60"/>
-              <w:left w:type="dxa" w:w="100"/>
-              <w:bottom w:type="dxa" w:w="60"/>
-              <w:right w:type="dxa" w:w="100"/>
-            </w:tcMar>
-          </w:tcPr>
-          <w:p>
-            <w:r>
-              <w:rPr>
-                <w:sz w:val="19"/>
-                <w:szCs w:val="19"/>
-              </w:rPr>
-              <w:t xml:space="preserve">Deliver the mobile app and user documents</w:t>
-            </w:r>
-          </w:p>
-        </w:tc>
-        <w:tc>
-          <w:tcPr>
-            <w:tcW w:type="dxa" w:w="4026"/>
-            <w:tcBorders>
-              <w:top w:val="single" w:color="B8C2D0" w:sz="4"/>
-              <w:left w:val="single" w:color="B8C2D0" w:sz="4"/>
-              <w:bottom w:val="single" w:color="B8C2D0" w:sz="4"/>
-              <w:right w:val="single" w:color="B8C2D0" w:sz="4"/>
-            </w:tcBorders>
-            <w:shd w:fill="FFFFFF" w:color="auto" w:val="clear"/>
-            <w:tcMar>
-              <w:top w:type="dxa" w:w="60"/>
-              <w:left w:type="dxa" w:w="100"/>
-              <w:bottom w:type="dxa" w:w="60"/>
-              <w:right w:type="dxa" w:w="100"/>
-            </w:tcMar>
-          </w:tcPr>
-          <w:p>
-            <w:r>
-              <w:rPr>
-                <w:sz w:val="19"/>
-                <w:szCs w:val="19"/>
-              </w:rPr>
-              <w:t xml:space="preserve">The Flutter app covers login, learning, quizzes, phishing and incidents; the user manual is finished</w:t>
-            </w:r>
-          </w:p>
-        </w:tc>
-        <w:tc>
-          <w:tcPr>
-            <w:tcW w:type="dxa" w:w="1100"/>
-            <w:tcBorders>
-              <w:top w:val="single" w:color="B8C2D0" w:sz="4"/>
-              <w:left w:val="single" w:color="B8C2D0" w:sz="4"/>
-              <w:bottom w:val="single" w:color="B8C2D0" w:sz="4"/>
-              <w:right w:val="single" w:color="B8C2D0" w:sz="4"/>
-            </w:tcBorders>
-            <w:shd w:fill="FFFFFF" w:color="auto" w:val="clear"/>
-            <w:tcMar>
-              <w:top w:type="dxa" w:w="60"/>
-              <w:left w:type="dxa" w:w="100"/>
-              <w:bottom w:type="dxa" w:w="60"/>
-              <w:right w:type="dxa" w:w="100"/>
-            </w:tcMar>
-          </w:tcPr>
-          <w:p>
-            <w:r>
-              <w:rPr>
-                <w:sz w:val="19"/>
-                <w:szCs w:val="19"/>
-              </w:rPr>
-              <w:t xml:space="preserve">Week 13</w:t>
             </w:r>
           </w:p>
         </w:tc>
@@ -4478,7 +3177,7 @@
         <w:spacing w:after="120" w:line="300"/>
       </w:pPr>
       <w:r>
-        <w:t xml:space="preserve">CyberShield Hub replaces the manual and separate practices with one connected system. Each user has a role. The main processes are shown below.</w:t>
+        <w:t xml:space="preserve">CyberShield Hub is one connected system with a role for each user. The major processes are:</w:t>
       </w:r>
     </w:p>
     <w:p>
@@ -4494,7 +3193,7 @@
           <w:sz w:val="19"/>
           <w:szCs w:val="19"/>
         </w:rPr>
-        <w:t xml:space="preserve">Table 1.6: Main processes of the proposed system</w:t>
+        <w:t xml:space="preserve">Table 1.5: Major processes</w:t>
       </w:r>
     </w:p>
     <w:tbl>
@@ -4749,7 +3448,7 @@
                 <w:sz w:val="19"/>
                 <w:szCs w:val="19"/>
               </w:rPr>
-              <w:t xml:space="preserve">Browse lessons by category; read rich content; track progress; bookmark; get suggestions. Admins write and edit lessons and categories.</w:t>
+              <w:t xml:space="preserve">Browse lessons by category; read content; track progress; bookmark; get suggestions. Admins write and edit lessons and categories.</w:t>
             </w:r>
           </w:p>
         </w:tc>
@@ -5007,7 +3706,7 @@
                 <w:sz w:val="19"/>
                 <w:szCs w:val="19"/>
               </w:rPr>
-              <w:t xml:space="preserve">Report an incident with evidence, or save a draft. The system makes a reference (INC-date-code) and a priority. Officers sort the reports on a board, assign them, escalate them and move them through Open, Investigating, Escalated, Resolved and Closed. A timeline keeps every step.</w:t>
+              <w:t xml:space="preserve">Report an incident with evidence, or save a draft. The system makes a reference (INC-date-code) and a priority. Administrators sort the reports on a board, assign them, escalate them and move them through Open, Investigating, Escalated, Resolved and Closed. A timeline keeps every step.</w:t>
             </w:r>
           </w:p>
         </w:tc>
@@ -5034,7 +3733,7 @@
                 <w:sz w:val="19"/>
                 <w:szCs w:val="19"/>
               </w:rPr>
-              <w:t xml:space="preserve">Reporters; officers</w:t>
+              <w:t xml:space="preserve">Reporters; administrators</w:t>
             </w:r>
           </w:p>
         </w:tc>
@@ -5066,7 +3765,7 @@
                 <w:sz w:val="19"/>
                 <w:szCs w:val="19"/>
               </w:rPr>
-              <w:t xml:space="preserve">6. Alerts and notifications</w:t>
+              <w:t xml:space="preserve">6. Analytics</w:t>
             </w:r>
           </w:p>
         </w:tc>
@@ -5093,7 +3792,7 @@
                 <w:sz w:val="19"/>
                 <w:szCs w:val="19"/>
               </w:rPr>
-              <w:t xml:space="preserve">Administrators publish alerts for an audience. Each eligible user gets a notification and can mark it as read.</w:t>
+              <w:t xml:space="preserve">A personal dashboard (security score, progress, quiz and phishing results) and organisation reports for administrators.</w:t>
             </w:r>
           </w:p>
         </w:tc>
@@ -5120,7 +3819,7 @@
                 <w:sz w:val="19"/>
                 <w:szCs w:val="19"/>
               </w:rPr>
-              <w:t xml:space="preserve">All users; admins publish</w:t>
+              <w:t xml:space="preserve">All users; administrators see the organisation</w:t>
             </w:r>
           </w:p>
         </w:tc>
@@ -5152,7 +3851,7 @@
                 <w:sz w:val="19"/>
                 <w:szCs w:val="19"/>
               </w:rPr>
-              <w:t xml:space="preserve">7. Analytics</w:t>
+              <w:t xml:space="preserve">7. Audit</w:t>
             </w:r>
           </w:p>
         </w:tc>
@@ -5179,7 +3878,7 @@
                 <w:sz w:val="19"/>
                 <w:szCs w:val="19"/>
               </w:rPr>
-              <w:t xml:space="preserve">A personal dashboard (security score, progress, quiz and phishing results) and organisation reports for officers and administrators.</w:t>
+              <w:t xml:space="preserve">A middleware records each data-changing request. Administrators search, filter and export the log.</w:t>
             </w:r>
           </w:p>
         </w:tc>
@@ -5206,93 +3905,7 @@
                 <w:sz w:val="19"/>
                 <w:szCs w:val="19"/>
               </w:rPr>
-              <w:t xml:space="preserve">All users; officers see the organisation</w:t>
-            </w:r>
-          </w:p>
-        </w:tc>
-      </w:tr>
-      <w:tr>
-        <w:trPr>
-          <w:cantSplit/>
-        </w:trPr>
-        <w:tc>
-          <w:tcPr>
-            <w:tcW w:type="dxa" w:w="2200"/>
-            <w:tcBorders>
-              <w:top w:val="single" w:color="B8C2D0" w:sz="4"/>
-              <w:left w:val="single" w:color="B8C2D0" w:sz="4"/>
-              <w:bottom w:val="single" w:color="B8C2D0" w:sz="4"/>
-              <w:right w:val="single" w:color="B8C2D0" w:sz="4"/>
-            </w:tcBorders>
-            <w:shd w:fill="FFFFFF" w:color="auto" w:val="clear"/>
-            <w:tcMar>
-              <w:top w:type="dxa" w:w="60"/>
-              <w:left w:type="dxa" w:w="100"/>
-              <w:bottom w:type="dxa" w:w="60"/>
-              <w:right w:type="dxa" w:w="100"/>
-            </w:tcMar>
-          </w:tcPr>
-          <w:p>
-            <w:r>
-              <w:rPr>
-                <w:sz w:val="19"/>
-                <w:szCs w:val="19"/>
-              </w:rPr>
-              <w:t xml:space="preserve">8. Audit</w:t>
-            </w:r>
-          </w:p>
-        </w:tc>
-        <w:tc>
-          <w:tcPr>
-            <w:tcW w:type="dxa" w:w="5226"/>
-            <w:tcBorders>
-              <w:top w:val="single" w:color="B8C2D0" w:sz="4"/>
-              <w:left w:val="single" w:color="B8C2D0" w:sz="4"/>
-              <w:bottom w:val="single" w:color="B8C2D0" w:sz="4"/>
-              <w:right w:val="single" w:color="B8C2D0" w:sz="4"/>
-            </w:tcBorders>
-            <w:shd w:fill="FFFFFF" w:color="auto" w:val="clear"/>
-            <w:tcMar>
-              <w:top w:type="dxa" w:w="60"/>
-              <w:left w:type="dxa" w:w="100"/>
-              <w:bottom w:type="dxa" w:w="60"/>
-              <w:right w:type="dxa" w:w="100"/>
-            </w:tcMar>
-          </w:tcPr>
-          <w:p>
-            <w:r>
-              <w:rPr>
-                <w:sz w:val="19"/>
-                <w:szCs w:val="19"/>
-              </w:rPr>
-              <w:t xml:space="preserve">A middleware records each data-changing request. Officers and administrators search, filter and export the log.</w:t>
-            </w:r>
-          </w:p>
-        </w:tc>
-        <w:tc>
-          <w:tcPr>
-            <w:tcW w:type="dxa" w:w="1600"/>
-            <w:tcBorders>
-              <w:top w:val="single" w:color="B8C2D0" w:sz="4"/>
-              <w:left w:val="single" w:color="B8C2D0" w:sz="4"/>
-              <w:bottom w:val="single" w:color="B8C2D0" w:sz="4"/>
-              <w:right w:val="single" w:color="B8C2D0" w:sz="4"/>
-            </w:tcBorders>
-            <w:shd w:fill="FFFFFF" w:color="auto" w:val="clear"/>
-            <w:tcMar>
-              <w:top w:type="dxa" w:w="60"/>
-              <w:left w:type="dxa" w:w="100"/>
-              <w:bottom w:type="dxa" w:w="60"/>
-              <w:right w:type="dxa" w:w="100"/>
-            </w:tcMar>
-          </w:tcPr>
-          <w:p>
-            <w:r>
-              <w:rPr>
-                <w:sz w:val="19"/>
-                <w:szCs w:val="19"/>
-              </w:rPr>
-              <w:t xml:space="preserve">Officers, admins</w:t>
+              <w:t xml:space="preserve">Admins</w:t>
             </w:r>
           </w:p>
         </w:tc>
@@ -5308,14 +3921,7 @@
         <w:spacing w:after="120" w:line="300"/>
       </w:pPr>
       <w:r>
-        <w:rPr>
-          <w:b/>
-          <w:bCs/>
-        </w:rPr>
-        <w:t xml:space="preserve">How the parts fit together.</w:t>
-      </w:r>
-      <w:r>
-        <w:t xml:space="preserve"> The React web app and the Flutter mobile app send requests to a versioned REST API (</w:t>
+        <w:t xml:space="preserve">The React web app sends requests to a REST API (</w:t>
       </w:r>
       <w:r>
         <w:rPr>
@@ -5326,7 +3932,7 @@
         <w:t xml:space="preserve">/api/v1</w:t>
       </w:r>
       <w:r>
-        <w:t xml:space="preserve">). Each request carries a token. The Django server checks the token and the role, checks the data, runs the business rules and then reads or writes the database. A middleware writes the audit trail. Evidence files are stored on the file system, and only allowed file types are accepted.</w:t>
+        <w:t xml:space="preserve">). Each request carries a token. The Django server checks the token and the role, checks the data, runs the business rules and reads or writes the database. A middleware writes the audit trail. Evidence files are stored on the file system. Only allowed file types are accepted.</w:t>
       </w:r>
     </w:p>
     <w:p>
@@ -5390,105 +3996,6 @@
           <w:szCs w:val="18"/>
         </w:rPr>
         <w:t xml:space="preserve">Figure 1.1: System architecture of CyberShield Hub</w:t>
-      </w:r>
-    </w:p>
-    <w:p>
-      <w:pPr>
-        <w:spacing w:after="120" w:line="300"/>
-      </w:pPr>
-      <w:r>
-        <w:rPr>
-          <w:b/>
-          <w:bCs/>
-        </w:rPr>
-        <w:t xml:space="preserve">Benefits.</w:t>
-      </w:r>
-      <w:r>
-        <w:t xml:space="preserve"> Training is continuous instead of once a year. Knowledge and behaviour can be measured. Incident reports follow one format and include evidence. The response is traceable. Managers can see the risk. The cost is low because every part of the stack is free and open source.</w:t>
-      </w:r>
-    </w:p>
-    <w:p>
-      <w:pPr>
-        <w:pStyle w:val="Heading2"/>
-      </w:pPr>
-      <w:r>
-        <w:t xml:space="preserve">1.5.1 Project deliverables</w:t>
-      </w:r>
-    </w:p>
-    <w:p>
-      <w:pPr>
-        <w:pStyle w:val="ListParagraph"/>
-        <w:numPr>
-          <w:ilvl w:val="0"/>
-          <w:numId w:val="2"/>
-        </w:numPr>
-        <w:spacing w:after="60" w:line="288"/>
-      </w:pPr>
-      <w:r>
-        <w:t xml:space="preserve">Web application (React) and API server (Django).</w:t>
-      </w:r>
-    </w:p>
-    <w:p>
-      <w:pPr>
-        <w:pStyle w:val="ListParagraph"/>
-        <w:numPr>
-          <w:ilvl w:val="0"/>
-          <w:numId w:val="2"/>
-        </w:numPr>
-        <w:spacing w:after="60" w:line="288"/>
-      </w:pPr>
-      <w:r>
-        <w:t xml:space="preserve">Mobile application (Flutter).</w:t>
-      </w:r>
-    </w:p>
-    <w:p>
-      <w:pPr>
-        <w:pStyle w:val="ListParagraph"/>
-        <w:numPr>
-          <w:ilvl w:val="0"/>
-          <w:numId w:val="2"/>
-        </w:numPr>
-        <w:spacing w:after="60" w:line="288"/>
-      </w:pPr>
-      <w:r>
-        <w:t xml:space="preserve">Database design and sample data (</w:t>
-      </w:r>
-      <w:r>
-        <w:rPr>
-          <w:rFonts w:ascii="Consolas" w:cs="Consolas" w:eastAsia="Consolas" w:hAnsi="Consolas"/>
-          <w:sz w:val="20"/>
-          <w:szCs w:val="20"/>
-        </w:rPr>
-        <w:t xml:space="preserve">seed_demo</w:t>
-      </w:r>
-      <w:r>
-        <w:t xml:space="preserve"> command).</w:t>
-      </w:r>
-    </w:p>
-    <w:p>
-      <w:pPr>
-        <w:pStyle w:val="ListParagraph"/>
-        <w:numPr>
-          <w:ilvl w:val="0"/>
-          <w:numId w:val="2"/>
-        </w:numPr>
-        <w:spacing w:after="60" w:line="288"/>
-      </w:pPr>
-      <w:r>
-        <w:t xml:space="preserve">348 automatic back-end tests.</w:t>
-      </w:r>
-    </w:p>
-    <w:p>
-      <w:pPr>
-        <w:pStyle w:val="ListParagraph"/>
-        <w:numPr>
-          <w:ilvl w:val="0"/>
-          <w:numId w:val="2"/>
-        </w:numPr>
-        <w:spacing w:after="60" w:line="288"/>
-      </w:pPr>
-      <w:r>
-        <w:t xml:space="preserve">Project documentation: seven chapters, this combined document and the user manual.</w:t>
       </w:r>
     </w:p>
     <w:p>

</xml_diff>